<commit_message>
SIREC Entrega 2: corrige MELDS, limpia notas internas y documenta pendientes
- 3.4/3.6: MELDS citado correctamente (Daugherty & Wilson, 2018) + referencia APA
- Elimina las notas [NOTA PARA EL EQUIPO] del .docx (version limpia)
- Nuevo Entrega 2 - PENDIENTES.md como fuente de verdad de pendientes
- README sincronizado con el estado actual

Co-Authored-By: Claude Opus 4.8 (1M context) <noreply@anthropic.com>
</commit_message>
<xml_diff>
--- a/entregas/Entrega 2 - SIREC (Desarrollo conceptual Design Thinking).docx
+++ b/entregas/Entrega 2 - SIREC (Desarrollo conceptual Design Thinking).docx
@@ -799,19 +799,6 @@
       </w:pPr>
       <w:r>
         <w:t>Los reportes reales usan lenguaje informal y modismos del español de México, lo que exige un modelo entrenado en ese registro y no una herramienta genérica.</w:t>
-      </w:r>
-    </w:p>
-    <w:p>
-      <w:pPr>
-        <w:spacing w:after="120"/>
-      </w:pPr>
-      <w:r>
-        <w:rPr>
-          <w:i/>
-          <w:color w:val="B00000"/>
-          <w:sz w:val="19"/>
-        </w:rPr>
-        <w:t>[NOTA PARA EL EQUIPO] El profesor insistió en «llegar al usuario final». Esta sección se sustenta en análisis de proceso y revisión de reportes reales. Para reforzarla, se recomienda realizar una breve entrevista o encuesta a un operador real de protección civil y añadir el instrumento en Anexos; si se hace, describir aquí muestra, edades/rol y hallazgos.</w:t>
       </w:r>
     </w:p>
     <w:p>
@@ -1838,19 +1825,6 @@
     </w:p>
     <w:p>
       <w:pPr>
-        <w:spacing w:after="120"/>
-      </w:pPr>
-      <w:r>
-        <w:rPr>
-          <w:i/>
-          <w:color w:val="B00000"/>
-          <w:sz w:val="19"/>
-        </w:rPr>
-        <w:t>[NOTA PARA EL EQUIPO] El fundamento teórico debe respaldarse con fuentes leídas por el equipo. Las referencias de Devlin et al. (2019), Cañete et al. (2020) y Cohen (1960) son reales y verificables; confírmenlas y, si citan algún concepto adicional, agréguenlo también en las Referencias.</w:t>
-      </w:r>
-    </w:p>
-    <w:p>
-      <w:pPr>
         <w:pStyle w:val="Heading2"/>
       </w:pPr>
       <w:r>
@@ -1866,7 +1840,7 @@
           <w:b w:val="0"/>
           <w:i w:val="0"/>
         </w:rPr>
-        <w:t>Una vez comprendida la necesidad y revisados los antecedentes, la etapa de idear genera un abanico de soluciones antes de comprometerse con una. El equipo consideró varios enfoques de IA para resolver la clasificación y priorización de reportes, y los evaluó con criterios de costo, viabilidad técnica, impacto esperado, esfuerzo y alineación con los principios MELDS de uso responsable de la IA.</w:t>
+        <w:t>Una vez comprendida la necesidad y revisados los antecedentes, la etapa de idear genera un abanico de soluciones antes de comprometerse con una. El equipo consideró varios enfoques de IA para resolver la clasificación y priorización de reportes, y los evaluó con criterios de costo, viabilidad técnica, impacto esperado, esfuerzo y alineación con los principios de adopción responsable de IA, en el marco MELDS de Daugherty y Wilson (2018), cuyo pilar de Liderazgo incorpora la IA responsable.</w:t>
       </w:r>
     </w:p>
     <w:tbl>
@@ -2683,19 +2657,6 @@
     </w:p>
     <w:p>
       <w:pPr>
-        <w:spacing w:after="120"/>
-      </w:pPr>
-      <w:r>
-        <w:rPr>
-          <w:i/>
-          <w:color w:val="B00000"/>
-          <w:sz w:val="19"/>
-        </w:rPr>
-        <w:t>[NOTA PARA EL EQUIPO] Si disponen de capturas del formulario y del panel ya construidos, insértenlas aquí como evidencia del prototipo (o wireframes en Anexos).</w:t>
-      </w:r>
-    </w:p>
-    <w:p>
-      <w:pPr>
         <w:pStyle w:val="Heading2"/>
       </w:pPr>
       <w:r>
@@ -3027,12 +2988,13 @@
             <w:tcW w:type="dxa" w:w="1728"/>
           </w:tcPr>
           <w:p>
-            <w:r/>
+            <w:r>
+              <w:t>Adopción responsable de IA — pilar Liderazgo de MELDS (15%)</w:t>
+            </w:r>
             <w:r>
               <w:rPr>
                 <w:sz w:val="19"/>
               </w:rPr>
-              <w:t>Alineación con MELDS / uso responsable (15%)</w:t>
             </w:r>
           </w:p>
         </w:tc>
@@ -3256,19 +3218,6 @@
       </w:r>
     </w:p>
     <w:p>
-      <w:pPr>
-        <w:spacing w:after="120"/>
-      </w:pPr>
-      <w:r>
-        <w:rPr>
-          <w:i/>
-          <w:color w:val="B00000"/>
-          <w:sz w:val="19"/>
-        </w:rPr>
-        <w:t>[NOTA PARA EL EQUIPO] El profesor pidió investigar el significado y los principios de MELDS en el material de la asignatura y citarlos correctamente; ajusten la redacción de este criterio a esa definición oficial.</w:t>
-      </w:r>
-    </w:p>
-    <w:p>
       <w:r>
         <w:br w:type="page"/>
       </w:r>
@@ -3297,6 +3246,24 @@
       </w:pPr>
       <w:r>
         <w:t>Cohen, J. (1960). A coefficient of agreement for nominal scales. Educational and Psychological Measurement, 20(1), 37-46. https://doi.org/10.1177/001316446002000104</w:t>
+      </w:r>
+    </w:p>
+    <w:p>
+      <w:pPr>
+        <w:spacing w:after="160"/>
+        <w:ind w:left="720" w:hanging="720"/>
+      </w:pPr>
+      <w:r>
+        <w:t xml:space="preserve">Daugherty, P. R., &amp; Wilson, H. J. (2018). </w:t>
+      </w:r>
+      <w:r>
+        <w:rPr>
+          <w:i/>
+        </w:rPr>
+        <w:t>Human + machine: Reimagining work in the age of AI</w:t>
+      </w:r>
+      <w:r>
+        <w:t>. Harvard Business Review Press.</w:t>
       </w:r>
     </w:p>
     <w:p>

</xml_diff>

<commit_message>
SIREC Entrega 2: todas las referencias con link web verificable
- Cañete et al. (2020) BETO -> PDF oficial U. de Chile
- Daugherty & Wilson (2018) -> Google Books
- Franco Cantos (2024) -> repositorio institucional PUCE
- Se conservan las 3 fuentes de la Entrega 1 (Franco Cantos, Imran, Paltin)
- Links verificados (HTTP 200 / DOI canonico)

Co-Authored-By: Claude Opus 4.8 (1M context) <noreply@anthropic.com>
</commit_message>
<xml_diff>
--- a/entregas/Entrega 2 - SIREC (Desarrollo conceptual Design Thinking).docx
+++ b/entregas/Entrega 2 - SIREC (Desarrollo conceptual Design Thinking).docx
@@ -3236,7 +3236,7 @@
         <w:ind w:left="720" w:hanging="720"/>
       </w:pPr>
       <w:r>
-        <w:t>Cañete, J., Chaperon, G., Fuentes, R., Ho, J.-H., Kang, H., &amp; Pérez, J. (2020). Spanish pre-trained BERT model and evaluation data. En PML4DC at ICLR 2020.</w:t>
+        <w:t>Cañete, J., Chaperon, G., Fuentes, R., Ho, J.-H., Kang, H., &amp; Pérez, J. (2020). Spanish pre-trained BERT model and evaluation data. En PML4DC at ICLR 2020. https://users.dcc.uchile.cl/~jperez/papers/pml4dc2020.pdf</w:t>
       </w:r>
     </w:p>
     <w:p>
@@ -3263,7 +3263,7 @@
         <w:t>Human + machine: Reimagining work in the age of AI</w:t>
       </w:r>
       <w:r>
-        <w:t>. Harvard Business Review Press.</w:t>
+        <w:t>. Harvard Business Review Press. https://books.google.com/books/about/Human_+_Machine.html?id=wpY4DwAAQBAJ</w:t>
       </w:r>
     </w:p>
     <w:p>
@@ -3281,7 +3281,7 @@
         <w:ind w:left="720" w:hanging="720"/>
       </w:pPr>
       <w:r>
-        <w:t>Franco Cantos, J. H. (2024). Identificación automática de tweets de emergencia en la red social "X": caso de estudio en Ecuador [Tesis de maestría, Pontificia Universidad Católica del Ecuador].</w:t>
+        <w:t>Franco Cantos, J. H. (2024). Identificación automática de tweets de emergencia en la red social "X": caso de estudio en Ecuador [Tesis de maestría, Pontificia Universidad Católica del Ecuador]. https://repositorio.puce.edu.ec/server/api/core/bitstreams/17173477-6e8e-49ee-b041-3289294c5e3d/content</w:t>
       </w:r>
     </w:p>
     <w:p>

</xml_diff>

<commit_message>
SIREC Entrega 2: agrega criterio de urgencia y origen del corpus (3.2)
Cubre dos comentarios del profesor que faltaban:
- Criterio de urgencia: define alta/media/baja con principio rector
  (personas expuestas -> nivel superior) y ejemplos; remite a la guia.
- Origen y composicion del corpus: fuentes reales publicas de Veracruz
  anonimizadas + sinteticos declarados; test 100% real; trazabilidad
  cuantificada diferida al capitulo de metodologia/validacion.

Criterio de urgencia anclado a la distribucion real etiquetada.

Co-Authored-By: Claude Opus 4.8 (1M context) <noreply@anthropic.com>
</commit_message>
<xml_diff>
--- a/entregas/Entrega 2 - SIREC (Desarrollo conceptual Design Thinking).docx
+++ b/entregas/Entrega 2 - SIREC (Desarrollo conceptual Design Thinking).docx
@@ -1316,6 +1316,34 @@
           <w:i w:val="0"/>
         </w:rPr>
         <w:t>Estos criterios de éxito son coherentes con el objetivo general y serán los indicadores que se midan en el Capítulo 6.</w:t>
+      </w:r>
+    </w:p>
+    <w:p>
+      <w:pPr>
+        <w:spacing w:after="120"/>
+      </w:pPr>
+      <w:r>
+        <w:rPr>
+          <w:b/>
+        </w:rPr>
+        <w:t xml:space="preserve">Criterio de urgencia. </w:t>
+      </w:r>
+      <w:r>
+        <w:t>Se definen tres niveles según el riesgo para las personas. La urgencia es alta cuando existe riesgo inminente para la vida o la integridad física (por ejemplo, personas atrapadas o heridas, incendios o explosiones con gente cerca, o accidentes graves); es media cuando hay una afectación relevante o una situación que puede escalar, pero sin peligro inmediato para la vida (por ejemplo, un vehículo volcado sin personas atrapadas o una vivienda con daños materiales); y es baja en incidentes menores o de carácter informativo, sin afectación clara a personas. El principio rector, aplicado ante la duda, es que si hay personas expuestas se asigna el nivel superior, pues en emergencias un falso negativo en la urgencia es el error más costoso. El criterio completo, con más ejemplos de frontera, se documenta en la guía de etiquetado del proyecto.</w:t>
+      </w:r>
+    </w:p>
+    <w:p>
+      <w:pPr>
+        <w:spacing w:after="120"/>
+      </w:pPr>
+      <w:r>
+        <w:rPr>
+          <w:b/>
+        </w:rPr>
+        <w:t xml:space="preserve">Origen y composición del corpus. </w:t>
+      </w:r>
+      <w:r>
+        <w:t>Como no existe un corpus público para este dominio en español de México, el equipo construye uno propio. Los reportes reales proceden de fuentes públicas de contingencias ocurridas en Veracruz (publicaciones en redes sociales y notas de prensa que citan reportes ciudadanos) y se anonimizan antes de su uso, eliminando nombres, teléfonos y direcciones exactas. Este conjunto real se complementa con reportes sintéticos, generados y declarados explícitamente como tales para reforzar la cobertura de las clases menos frecuentes; en ningún caso se evalúa el modelo con datos sintéticos: el conjunto de prueba es 100 % real. La trazabilidad cuantificada del corpus (proporción de datos reales frente a sintéticos y su distribución por clase) se reporta en el capítulo de metodología y validación.</w:t>
       </w:r>
     </w:p>
     <w:p>

</xml_diff>

<commit_message>
Entrega 2: agrega visitas presenciales a autoridades en Empatizar (3.1)
- 3.1: subseccion "Acercamiento presencial a las autoridades de emergencia"
  (Proteccion Civil Alcaldia Venustiano Carranza + Policia Municipal de
  Veracruz, semana del 13-jul-2026) + hallazgo clave. Complementa la
  encuesta ciudadana (n=42) como evidencia real de empatia con el usuario.
- PENDIENTES.md: registra la evidencia anadida.

Co-Authored-By: Claude Opus 4.8 (1M context) <noreply@anthropic.com>
</commit_message>
<xml_diff>
--- a/entregas/Entrega 2 - SIREC (Desarrollo conceptual Design Thinking).docx
+++ b/entregas/Entrega 2 - SIREC (Desarrollo conceptual Design Thinking).docx
@@ -397,6 +397,53 @@
       </w:pPr>
       <w:r>
         <w:t>Como técnicas empleamos el análisis del proceso y la observación documental —estudiamos el flujo de trabajo del triaje manual en una coordinación municipal de protección civil y revisamos reportes ciudadanos reales publicados durante contingencias pasadas en Veracruz (publicaciones en redes sociales y notas de prensa que citan reportes)— y las complementamos con una encuesta ciudadana anónima aplicada mediante un formulario en línea, que recogió 42 respuestas de personas que vivieron o presenciaron una emergencia. Con ello caracterizamos cómo se expresa la ciudadanía, qué dolores enfrenta y qué espera de la respuesta, y definimos los perfiles de usuario y el mapa de empatía (dolores y beneficios esperados).</w:t>
+      </w:r>
+    </w:p>
+    <w:p>
+      <w:pPr>
+        <w:pStyle w:val="Heading3"/>
+        <w:spacing w:after="120"/>
+      </w:pPr>
+      <w:r>
+        <w:t>Acercamiento presencial a las autoridades de emergencia</w:t>
+      </w:r>
+    </w:p>
+    <w:p>
+      <w:pPr>
+        <w:spacing w:after="120"/>
+      </w:pPr>
+      <w:r>
+        <w:t>Como parte del trabajo de empatía, durante la semana del 13 de julio de 2026 el equipo realizó dos visitas presenciales a instancias que hoy reciben y priorizan reportes de emergencia: la Unidad de Protección Civil de la Alcaldía Venustiano Carranza (Av. Francisco del Paso y Troncoso 219, anexo «D», colonia Jardín Balbuena, Ciudad de México) y la Comandancia de la Policía Municipal de Veracruz. El objetivo era conocer, de la propia voz del usuario final, cómo determinan actualmente el nivel de urgencia y de riesgo de cada reporte.</w:t>
+      </w:r>
+    </w:p>
+    <w:p>
+      <w:pPr>
+        <w:spacing w:after="120"/>
+      </w:pPr>
+      <w:r>
+        <w:t>En ambos casos se nos explicó que cuentan con un sistema en el que las operadoras registran las urgencias y, a partir de ese registro, despachan las patrullas o los servicios necesarios. Sin embargo, de los comentarios del personal se desprende que son las propias operadoras quienes determinan el nivel de urgencia de forma subjetiva, con base en la conversación que sostienen con la persona que reporta, sin un criterio estandarizado explícito. Al intentar profundizar en qué sistemas utilizan y cómo lo hacen, el personal se mostró renuente a dar detalles por razones de privacidad y confidencialidad institucional.</w:t>
+      </w:r>
+    </w:p>
+    <w:p>
+      <w:pPr>
+        <w:spacing w:after="120"/>
+      </w:pPr>
+      <w:r>
+        <w:t>Este acercamiento, aunque no permitió documentar un procedimiento formal, constituye un hallazgo central de la etapa de empatía: hoy la determinación de la urgencia depende del criterio individual de cada operadora y no de una regla documentada y reproducible. Esa ausencia de un criterio estandarizado es, precisamente, la necesidad que SIREC busca cubrir mediante una guía de etiquetado explícita y un criterio de urgencia validado entre anotadores (kappa de Cohen). La reticencia por motivos de privacidad confirma además la importancia de trabajar con datos anonimizados, tal como contempla el proyecto.</w:t>
+      </w:r>
+    </w:p>
+    <w:p>
+      <w:pPr>
+        <w:spacing w:after="120"/>
+      </w:pPr>
+      <w:r>
+        <w:rPr>
+          <w:b/>
+        </w:rPr>
+        <w:t xml:space="preserve">Limitación metodológica: </w:t>
+      </w:r>
+      <w:r>
+        <w:t>El acceso a la información operativa de estas instituciones fue restringido; por ello la empatía se complementó con el análisis del proceso de triaje y la revisión de reportes ciudadanos públicos reales.</w:t>
       </w:r>
     </w:p>
     <w:p>
@@ -1068,6 +1115,15 @@
       </w:pPr>
       <w:r>
         <w:t>Emerge una necesidad no cubierta por el MVP: los ciudadanos piden seguimiento y trazabilidad del estatus de su reporte. Se registra como requerimiento de valor y trabajo futuro, sin ampliar el alcance de esta entrega.</w:t>
+      </w:r>
+    </w:p>
+    <w:p>
+      <w:pPr>
+        <w:pStyle w:val="ListBullet"/>
+        <w:spacing w:after="120"/>
+      </w:pPr>
+      <w:r>
+        <w:t>Las visitas presenciales a Protección Civil (Alcaldía Venustiano Carranza) y a la Policía Municipal de Veracruz revelaron que hoy el nivel de urgencia lo fija cada operadora de forma subjetiva, a partir de la conversación con quien reporta y sin un criterio estandarizado ni documentado: justo la brecha que SIREC atiende con su guía de etiquetado y el acuerdo entre anotadores.</w:t>
       </w:r>
     </w:p>
     <w:p>

</xml_diff>

<commit_message>
Entrega 2: ajustes de formato pedidos por el equipo
- Justificar todos los parrafos de cuerpo (incluye tablas)
- Nombre completo de la asignatura: "Seminario de Inteligencia Artificial"
  (sin abreviatura IA) en la portada
- Anexo A: elimina la numeracion doble en A.1 (el estilo de lista ya numera;
  se quito el numero escrito a mano)

Co-Authored-By: Claude Opus 4.8 (1M context) <noreply@anthropic.com>
</commit_message>
<xml_diff>
--- a/entregas/Entrega 2 - SIREC (Desarrollo conceptual Design Thinking).docx
+++ b/entregas/Entrega 2 - SIREC (Desarrollo conceptual Design Thinking).docx
@@ -22,7 +22,7 @@
         <w:rPr>
           <w:sz w:val="22"/>
         </w:rPr>
-        <w:t>Universidad Internacional de La Rioja (UNIR) — Seminario de IA</w:t>
+        <w:t>Universidad Internacional de La Rioja (UNIR) — Seminario de Inteligencia Artificial</w:t>
       </w:r>
     </w:p>
     <w:p/>
@@ -106,6 +106,7 @@
     <w:p>
       <w:pPr>
         <w:spacing w:after="120"/>
+        <w:jc w:val="both"/>
       </w:pPr>
       <w:r>
         <w:rPr>
@@ -118,6 +119,7 @@
     <w:p>
       <w:pPr>
         <w:spacing w:after="120"/>
+        <w:jc w:val="both"/>
       </w:pPr>
       <w:r>
         <w:rPr>
@@ -138,6 +140,7 @@
     <w:p>
       <w:pPr>
         <w:spacing w:after="120"/>
+        <w:jc w:val="both"/>
       </w:pPr>
       <w:r>
         <w:rPr>
@@ -150,6 +153,7 @@
     <w:p>
       <w:pPr>
         <w:spacing w:after="120"/>
+        <w:jc w:val="both"/>
       </w:pPr>
       <w:r>
         <w:rPr>
@@ -170,6 +174,7 @@
     <w:p>
       <w:pPr>
         <w:spacing w:after="120"/>
+        <w:jc w:val="both"/>
       </w:pPr>
       <w:r>
         <w:rPr>
@@ -182,6 +187,7 @@
     <w:p>
       <w:pPr>
         <w:pStyle w:val="ListBullet"/>
+        <w:jc w:val="both"/>
       </w:pPr>
       <w:r>
         <w:rPr>
@@ -196,6 +202,7 @@
     <w:p>
       <w:pPr>
         <w:pStyle w:val="ListBullet"/>
+        <w:jc w:val="both"/>
       </w:pPr>
       <w:r>
         <w:rPr>
@@ -210,6 +217,7 @@
     <w:p>
       <w:pPr>
         <w:pStyle w:val="ListBullet"/>
+        <w:jc w:val="both"/>
       </w:pPr>
       <w:r>
         <w:rPr>
@@ -224,6 +232,7 @@
     <w:p>
       <w:pPr>
         <w:pStyle w:val="ListBullet"/>
+        <w:jc w:val="both"/>
       </w:pPr>
       <w:r>
         <w:rPr>
@@ -238,6 +247,7 @@
     <w:p>
       <w:pPr>
         <w:spacing w:after="120"/>
+        <w:jc w:val="both"/>
       </w:pPr>
       <w:r>
         <w:rPr>
@@ -258,6 +268,7 @@
     <w:p>
       <w:pPr>
         <w:spacing w:after="120"/>
+        <w:jc w:val="both"/>
       </w:pPr>
       <w:r>
         <w:rPr>
@@ -286,6 +297,7 @@
     <w:p>
       <w:pPr>
         <w:spacing w:after="120"/>
+        <w:jc w:val="both"/>
       </w:pPr>
       <w:r>
         <w:rPr>
@@ -306,6 +318,7 @@
     <w:p>
       <w:pPr>
         <w:pStyle w:val="ListNumber"/>
+        <w:jc w:val="both"/>
       </w:pPr>
       <w:r>
         <w:t>Analizar los trabajos previos y el estado del arte en clasificación de reportes de emergencia mediante procesamiento del lenguaje natural, y definir el conjunto de siete categorías temáticas y tres niveles de urgencia del proyecto.</w:t>
@@ -314,6 +327,7 @@
     <w:p>
       <w:pPr>
         <w:pStyle w:val="ListNumber"/>
+        <w:jc w:val="both"/>
       </w:pPr>
       <w:r>
         <w:t>Construir un corpus propio de reportes en español de México, con un procedimiento de etiquetado documentado y validado mediante el acuerdo entre anotadores (kappa de Cohen).</w:t>
@@ -322,6 +336,7 @@
     <w:p>
       <w:pPr>
         <w:pStyle w:val="ListNumber"/>
+        <w:jc w:val="both"/>
       </w:pPr>
       <w:r>
         <w:t>Implementar un modelo de referencia (baseline) clásico basado en TF-IDF con regresión logística y/o máquinas de vectores de soporte, para contrastar resultados.</w:t>
@@ -330,6 +345,7 @@
     <w:p>
       <w:pPr>
         <w:pStyle w:val="ListNumber"/>
+        <w:jc w:val="both"/>
       </w:pPr>
       <w:r>
         <w:t>Ajustar mediante transferencia de aprendizaje un modelo de lenguaje preentrenado en español (BETO) para las tareas de clasificación temática y de urgencia.</w:t>
@@ -338,6 +354,7 @@
     <w:p>
       <w:pPr>
         <w:pStyle w:val="ListNumber"/>
+        <w:jc w:val="both"/>
       </w:pPr>
       <w:r>
         <w:t>Evaluar el desempeño del modelo con métricas por clase (precisión, exhaustividad y medida F1) y matriz de confusión, priorizando la exhaustividad (recall) en las clases críticas (persona en riesgo y urgencia alta).</w:t>
@@ -346,6 +363,7 @@
     <w:p>
       <w:pPr>
         <w:pStyle w:val="ListNumber"/>
+        <w:jc w:val="both"/>
       </w:pPr>
       <w:r>
         <w:t>Integrar y desplegar el sistema de extremo a extremo (formulario, clasificador y panel priorizado), verificando su funcionamiento con pruebas de extremo a extremo y midiendo la latencia de respuesta.</w:t>
@@ -362,6 +380,7 @@
     <w:p>
       <w:pPr>
         <w:spacing w:after="120"/>
+        <w:jc w:val="both"/>
       </w:pPr>
       <w:r>
         <w:rPr>
@@ -382,6 +401,7 @@
     <w:p>
       <w:pPr>
         <w:spacing w:after="120"/>
+        <w:jc w:val="both"/>
       </w:pPr>
       <w:r>
         <w:rPr>
@@ -394,6 +414,7 @@
     <w:p>
       <w:pPr>
         <w:spacing w:after="120"/>
+        <w:jc w:val="both"/>
       </w:pPr>
       <w:r>
         <w:t>Como técnicas empleamos el análisis del proceso y la observación documental —estudiamos el flujo de trabajo del triaje manual en una coordinación municipal de protección civil y revisamos reportes ciudadanos reales publicados durante contingencias pasadas en Veracruz (publicaciones en redes sociales y notas de prensa que citan reportes)— y las complementamos con una encuesta ciudadana anónima aplicada mediante un formulario en línea, que recogió 42 respuestas de personas que vivieron o presenciaron una emergencia. Con ello caracterizamos cómo se expresa la ciudadanía, qué dolores enfrenta y qué espera de la respuesta, y definimos los perfiles de usuario y el mapa de empatía (dolores y beneficios esperados).</w:t>
@@ -411,6 +432,7 @@
     <w:p>
       <w:pPr>
         <w:spacing w:after="120"/>
+        <w:jc w:val="both"/>
       </w:pPr>
       <w:r>
         <w:t>Como parte del trabajo de empatía, durante la semana del 13 de julio de 2026 el equipo realizó dos visitas presenciales a instancias que hoy reciben y priorizan reportes de emergencia: la Unidad de Protección Civil de la Alcaldía Venustiano Carranza (Av. Francisco del Paso y Troncoso 219, anexo «D», colonia Jardín Balbuena, Ciudad de México) y la Comandancia de la Policía Municipal de Veracruz. El objetivo era conocer, de la propia voz del usuario final, cómo determinan actualmente el nivel de urgencia y de riesgo de cada reporte.</w:t>
@@ -419,6 +441,7 @@
     <w:p>
       <w:pPr>
         <w:spacing w:after="120"/>
+        <w:jc w:val="both"/>
       </w:pPr>
       <w:r>
         <w:t>En ambos casos se nos explicó que cuentan con un sistema en el que las operadoras registran las urgencias y, a partir de ese registro, despachan las patrullas o los servicios necesarios. Sin embargo, de los comentarios del personal se desprende que son las propias operadoras quienes determinan el nivel de urgencia de forma subjetiva, con base en la conversación que sostienen con la persona que reporta, sin un criterio estandarizado explícito. Al intentar profundizar en qué sistemas utilizan y cómo lo hacen, el personal se mostró renuente a dar detalles por razones de privacidad y confidencialidad institucional.</w:t>
@@ -427,6 +450,7 @@
     <w:p>
       <w:pPr>
         <w:spacing w:after="120"/>
+        <w:jc w:val="both"/>
       </w:pPr>
       <w:r>
         <w:t>Este acercamiento, aunque no permitió documentar un procedimiento formal, constituye un hallazgo central de la etapa de empatía: hoy la determinación de la urgencia depende del criterio individual de cada operadora y no de una regla documentada y reproducible. Esa ausencia de un criterio estandarizado es, precisamente, la necesidad que SIREC busca cubrir mediante una guía de etiquetado explícita y un criterio de urgencia validado entre anotadores (kappa de Cohen). La reticencia por motivos de privacidad confirma además la importancia de trabajar con datos anonimizados, tal como contempla el proyecto.</w:t>
@@ -435,6 +459,7 @@
     <w:p>
       <w:pPr>
         <w:spacing w:after="120"/>
+        <w:jc w:val="both"/>
       </w:pPr>
       <w:r>
         <w:rPr>
@@ -473,6 +498,9 @@
             <w:tcW w:type="dxa" w:w="2160"/>
           </w:tcPr>
           <w:p>
+            <w:pPr>
+              <w:jc w:val="both"/>
+            </w:pPr>
             <w:r/>
             <w:r>
               <w:rPr>
@@ -488,6 +516,9 @@
             <w:tcW w:type="dxa" w:w="2160"/>
           </w:tcPr>
           <w:p>
+            <w:pPr>
+              <w:jc w:val="both"/>
+            </w:pPr>
             <w:r/>
             <w:r>
               <w:rPr>
@@ -503,6 +534,9 @@
             <w:tcW w:type="dxa" w:w="2160"/>
           </w:tcPr>
           <w:p>
+            <w:pPr>
+              <w:jc w:val="both"/>
+            </w:pPr>
             <w:r/>
             <w:r>
               <w:rPr>
@@ -518,6 +552,9 @@
             <w:tcW w:type="dxa" w:w="2160"/>
           </w:tcPr>
           <w:p>
+            <w:pPr>
+              <w:jc w:val="both"/>
+            </w:pPr>
             <w:r/>
             <w:r>
               <w:rPr>
@@ -535,6 +572,9 @@
             <w:tcW w:type="dxa" w:w="2160"/>
           </w:tcPr>
           <w:p>
+            <w:pPr>
+              <w:jc w:val="both"/>
+            </w:pPr>
             <w:r/>
             <w:r>
               <w:rPr>
@@ -549,6 +589,9 @@
             <w:tcW w:type="dxa" w:w="2160"/>
           </w:tcPr>
           <w:p>
+            <w:pPr>
+              <w:jc w:val="both"/>
+            </w:pPr>
             <w:r/>
             <w:r>
               <w:rPr>
@@ -563,6 +606,9 @@
             <w:tcW w:type="dxa" w:w="2160"/>
           </w:tcPr>
           <w:p>
+            <w:pPr>
+              <w:jc w:val="both"/>
+            </w:pPr>
             <w:r/>
             <w:r>
               <w:rPr>
@@ -577,6 +623,9 @@
             <w:tcW w:type="dxa" w:w="2160"/>
           </w:tcPr>
           <w:p>
+            <w:pPr>
+              <w:jc w:val="both"/>
+            </w:pPr>
             <w:r/>
             <w:r>
               <w:rPr>
@@ -593,6 +642,9 @@
             <w:tcW w:type="dxa" w:w="2160"/>
           </w:tcPr>
           <w:p>
+            <w:pPr>
+              <w:jc w:val="both"/>
+            </w:pPr>
             <w:r/>
             <w:r>
               <w:rPr>
@@ -607,6 +659,9 @@
             <w:tcW w:type="dxa" w:w="2160"/>
           </w:tcPr>
           <w:p>
+            <w:pPr>
+              <w:jc w:val="both"/>
+            </w:pPr>
             <w:r/>
             <w:r>
               <w:rPr>
@@ -621,6 +676,9 @@
             <w:tcW w:type="dxa" w:w="2160"/>
           </w:tcPr>
           <w:p>
+            <w:pPr>
+              <w:jc w:val="both"/>
+            </w:pPr>
             <w:r/>
             <w:r>
               <w:rPr>
@@ -635,6 +693,9 @@
             <w:tcW w:type="dxa" w:w="2160"/>
           </w:tcPr>
           <w:p>
+            <w:pPr>
+              <w:jc w:val="both"/>
+            </w:pPr>
             <w:r>
               <w:rPr>
                 <w:b w:val="0"/>
@@ -659,7 +720,9 @@
       </w:r>
     </w:p>
     <w:p>
-      <w:pPr/>
+      <w:pPr>
+        <w:jc w:val="both"/>
+      </w:pPr>
       <w:r>
         <w:t>La encuesta confirma el problema desde la voz del usuario final. La muestra (42 respuestas) está compuesta mayoritariamente por personas con experiencia directa: el 83 % ha vivido o presenciado una emergencia. El principal dolor es el tiempo de espera y las llamadas que no se contestan, y la confianza en que la ayuda llegará a tiempo es baja. El canal de reporte es hoy casi exclusivamente la llamada al 911. Los principales indicadores se resumen a continuación.</w:t>
       </w:r>
@@ -680,6 +743,9 @@
             <w:tcW w:type="dxa" w:w="4320"/>
           </w:tcPr>
           <w:p>
+            <w:pPr>
+              <w:jc w:val="both"/>
+            </w:pPr>
             <w:r>
               <w:rPr>
                 <w:b/>
@@ -693,6 +759,9 @@
             <w:tcW w:type="dxa" w:w="4320"/>
           </w:tcPr>
           <w:p>
+            <w:pPr>
+              <w:jc w:val="both"/>
+            </w:pPr>
             <w:r>
               <w:rPr>
                 <w:b/>
@@ -708,6 +777,9 @@
             <w:tcW w:type="dxa" w:w="4320"/>
           </w:tcPr>
           <w:p>
+            <w:pPr>
+              <w:jc w:val="both"/>
+            </w:pPr>
             <w:r>
               <w:rPr>
                 <w:b w:val="0"/>
@@ -721,6 +793,9 @@
             <w:tcW w:type="dxa" w:w="4320"/>
           </w:tcPr>
           <w:p>
+            <w:pPr>
+              <w:jc w:val="both"/>
+            </w:pPr>
             <w:r>
               <w:rPr>
                 <w:b w:val="0"/>
@@ -736,6 +811,9 @@
             <w:tcW w:type="dxa" w:w="4320"/>
           </w:tcPr>
           <w:p>
+            <w:pPr>
+              <w:jc w:val="both"/>
+            </w:pPr>
             <w:r>
               <w:rPr>
                 <w:b w:val="0"/>
@@ -749,6 +827,9 @@
             <w:tcW w:type="dxa" w:w="4320"/>
           </w:tcPr>
           <w:p>
+            <w:pPr>
+              <w:jc w:val="both"/>
+            </w:pPr>
             <w:r>
               <w:rPr>
                 <w:b w:val="0"/>
@@ -764,6 +845,9 @@
             <w:tcW w:type="dxa" w:w="4320"/>
           </w:tcPr>
           <w:p>
+            <w:pPr>
+              <w:jc w:val="both"/>
+            </w:pPr>
             <w:r>
               <w:rPr>
                 <w:b w:val="0"/>
@@ -777,6 +861,9 @@
             <w:tcW w:type="dxa" w:w="4320"/>
           </w:tcPr>
           <w:p>
+            <w:pPr>
+              <w:jc w:val="both"/>
+            </w:pPr>
             <w:r>
               <w:rPr>
                 <w:b w:val="0"/>
@@ -792,6 +879,9 @@
             <w:tcW w:type="dxa" w:w="4320"/>
           </w:tcPr>
           <w:p>
+            <w:pPr>
+              <w:jc w:val="both"/>
+            </w:pPr>
             <w:r>
               <w:rPr>
                 <w:b w:val="0"/>
@@ -805,6 +895,9 @@
             <w:tcW w:type="dxa" w:w="4320"/>
           </w:tcPr>
           <w:p>
+            <w:pPr>
+              <w:jc w:val="both"/>
+            </w:pPr>
             <w:r>
               <w:rPr>
                 <w:b w:val="0"/>
@@ -820,6 +913,9 @@
             <w:tcW w:type="dxa" w:w="4320"/>
           </w:tcPr>
           <w:p>
+            <w:pPr>
+              <w:jc w:val="both"/>
+            </w:pPr>
             <w:r>
               <w:rPr>
                 <w:b w:val="0"/>
@@ -833,6 +929,9 @@
             <w:tcW w:type="dxa" w:w="4320"/>
           </w:tcPr>
           <w:p>
+            <w:pPr>
+              <w:jc w:val="both"/>
+            </w:pPr>
             <w:r>
               <w:rPr>
                 <w:b w:val="0"/>
@@ -848,6 +947,9 @@
             <w:tcW w:type="dxa" w:w="4320"/>
           </w:tcPr>
           <w:p>
+            <w:pPr>
+              <w:jc w:val="both"/>
+            </w:pPr>
             <w:r>
               <w:rPr>
                 <w:b w:val="0"/>
@@ -861,6 +963,9 @@
             <w:tcW w:type="dxa" w:w="4320"/>
           </w:tcPr>
           <w:p>
+            <w:pPr>
+              <w:jc w:val="both"/>
+            </w:pPr>
             <w:r>
               <w:rPr>
                 <w:b w:val="0"/>
@@ -876,6 +981,9 @@
             <w:tcW w:type="dxa" w:w="4320"/>
           </w:tcPr>
           <w:p>
+            <w:pPr>
+              <w:jc w:val="both"/>
+            </w:pPr>
             <w:r>
               <w:rPr>
                 <w:b w:val="0"/>
@@ -889,6 +997,9 @@
             <w:tcW w:type="dxa" w:w="4320"/>
           </w:tcPr>
           <w:p>
+            <w:pPr>
+              <w:jc w:val="both"/>
+            </w:pPr>
             <w:r>
               <w:rPr>
                 <w:b w:val="0"/>
@@ -928,6 +1039,9 @@
             <w:tcW w:type="dxa" w:w="2880"/>
           </w:tcPr>
           <w:p>
+            <w:pPr>
+              <w:jc w:val="both"/>
+            </w:pPr>
             <w:r/>
             <w:r>
               <w:rPr>
@@ -943,6 +1057,9 @@
             <w:tcW w:type="dxa" w:w="2880"/>
           </w:tcPr>
           <w:p>
+            <w:pPr>
+              <w:jc w:val="both"/>
+            </w:pPr>
             <w:r/>
             <w:r>
               <w:rPr>
@@ -958,6 +1075,9 @@
             <w:tcW w:type="dxa" w:w="2880"/>
           </w:tcPr>
           <w:p>
+            <w:pPr>
+              <w:jc w:val="both"/>
+            </w:pPr>
             <w:r/>
             <w:r>
               <w:rPr>
@@ -975,6 +1095,9 @@
             <w:tcW w:type="dxa" w:w="2880"/>
           </w:tcPr>
           <w:p>
+            <w:pPr>
+              <w:jc w:val="both"/>
+            </w:pPr>
             <w:r/>
             <w:r>
               <w:rPr>
@@ -989,6 +1112,9 @@
             <w:tcW w:type="dxa" w:w="2880"/>
           </w:tcPr>
           <w:p>
+            <w:pPr>
+              <w:jc w:val="both"/>
+            </w:pPr>
             <w:r/>
             <w:r>
               <w:rPr>
@@ -1003,6 +1129,9 @@
             <w:tcW w:type="dxa" w:w="2880"/>
           </w:tcPr>
           <w:p>
+            <w:pPr>
+              <w:jc w:val="both"/>
+            </w:pPr>
             <w:r/>
             <w:r>
               <w:rPr>
@@ -1019,6 +1148,9 @@
             <w:tcW w:type="dxa" w:w="2880"/>
           </w:tcPr>
           <w:p>
+            <w:pPr>
+              <w:jc w:val="both"/>
+            </w:pPr>
             <w:r/>
             <w:r>
               <w:rPr>
@@ -1033,6 +1165,9 @@
             <w:tcW w:type="dxa" w:w="2880"/>
           </w:tcPr>
           <w:p>
+            <w:pPr>
+              <w:jc w:val="both"/>
+            </w:pPr>
             <w:r>
               <w:rPr>
                 <w:b w:val="0"/>
@@ -1046,6 +1181,9 @@
             <w:tcW w:type="dxa" w:w="2880"/>
           </w:tcPr>
           <w:p>
+            <w:pPr>
+              <w:jc w:val="both"/>
+            </w:pPr>
             <w:r>
               <w:rPr>
                 <w:b w:val="0"/>
@@ -1072,6 +1210,7 @@
     <w:p>
       <w:pPr>
         <w:pStyle w:val="ListBullet"/>
+        <w:jc w:val="both"/>
       </w:pPr>
       <w:r>
         <w:t>El operador no necesita otra bandeja de mensajes, sino una lista ya priorizada por riesgo.</w:t>
@@ -1080,6 +1219,7 @@
     <w:p>
       <w:pPr>
         <w:pStyle w:val="ListBullet"/>
+        <w:jc w:val="both"/>
       </w:pPr>
       <w:r>
         <w:t>La señal de urgencia más importante es la presencia de personas en peligro; un falso negativo en esa clase es el error más costoso.</w:t>
@@ -1088,6 +1228,7 @@
     <w:p>
       <w:pPr>
         <w:pStyle w:val="ListBullet"/>
+        <w:jc w:val="both"/>
       </w:pPr>
       <w:r>
         <w:t>Los reportes reales usan lenguaje informal y modismos del español de México, lo que exige un modelo entrenado en ese registro y no una herramienta genérica.</w:t>
@@ -1096,6 +1237,7 @@
     <w:p>
       <w:pPr>
         <w:pStyle w:val="ListBullet"/>
+        <w:jc w:val="both"/>
       </w:pPr>
       <w:r>
         <w:t>La encuesta ciudadana (n = 42) confirma el problema desde la voz del usuario final: la confianza en que la ayuda llegará a tiempo es baja (media de 2.3 sobre 5; el 64 % la califica con 1 o 2) y el dolor más repetido es la espera y las llamadas que no se contestan.</w:t>
@@ -1104,6 +1246,7 @@
     <w:p>
       <w:pPr>
         <w:pStyle w:val="ListBullet"/>
+        <w:jc w:val="both"/>
       </w:pPr>
       <w:r>
         <w:t>El reporte se realiza hoy casi exclusivamente por llamada al 911 (22 de las respuestas), con uso marginal de medios digitales; esto respalda la pertinencia de un formulario web como canal de entrada del MVP.</w:t>
@@ -1112,6 +1255,7 @@
     <w:p>
       <w:pPr>
         <w:pStyle w:val="ListBullet"/>
+        <w:jc w:val="both"/>
       </w:pPr>
       <w:r>
         <w:t>Emerge una necesidad no cubierta por el MVP: los ciudadanos piden seguimiento y trazabilidad del estatus de su reporte. Se registra como requerimiento de valor y trabajo futuro, sin ampliar el alcance de esta entrega.</w:t>
@@ -1121,6 +1265,7 @@
       <w:pPr>
         <w:pStyle w:val="ListBullet"/>
         <w:spacing w:after="120"/>
+        <w:jc w:val="both"/>
       </w:pPr>
       <w:r>
         <w:t>Las visitas presenciales a Protección Civil (Alcaldía Venustiano Carranza) y a la Policía Municipal de Veracruz revelaron que hoy el nivel de urgencia lo fija cada operadora de forma subjetiva, a partir de la conversación con quien reporta y sin un criterio estandarizado ni documentado: justo la brecha que SIREC atiende con su guía de etiquetado y el acuerdo entre anotadores.</w:t>
@@ -1137,6 +1282,7 @@
     <w:p>
       <w:pPr>
         <w:spacing w:after="120"/>
+        <w:jc w:val="both"/>
       </w:pPr>
       <w:r>
         <w:rPr>
@@ -1157,6 +1303,7 @@
     <w:p>
       <w:pPr>
         <w:pStyle w:val="ListBullet"/>
+        <w:jc w:val="both"/>
       </w:pPr>
       <w:r>
         <w:t>¿Cómo podríamos clasificar automáticamente cada reporte ciudadano por tema y urgencia para que el operador no tenga que leerlos uno por uno?</w:t>
@@ -1165,6 +1312,7 @@
     <w:p>
       <w:pPr>
         <w:pStyle w:val="ListBullet"/>
+        <w:jc w:val="both"/>
       </w:pPr>
       <w:r>
         <w:t>¿Cómo podríamos ordenar los reportes de modo que las situaciones con vidas en riesgo aparezcan siempre primero, sin importar su orden de llegada?</w:t>
@@ -1173,6 +1321,7 @@
     <w:p>
       <w:pPr>
         <w:pStyle w:val="ListBullet"/>
+        <w:jc w:val="both"/>
       </w:pPr>
       <w:r>
         <w:t>¿Cómo podríamos maximizar la exhaustividad (recall) en las clases críticas (persona en riesgo, urgencia alta) para no dejar pasar un caso grave?</w:t>
@@ -1181,6 +1330,7 @@
     <w:p>
       <w:pPr>
         <w:pStyle w:val="ListBullet"/>
+        <w:jc w:val="both"/>
       </w:pPr>
       <w:r>
         <w:t>¿Cómo podríamos construir y validar un corpus en español de México cuando no existe uno público para este dominio?</w:t>
@@ -1189,6 +1339,7 @@
     <w:p>
       <w:pPr>
         <w:pStyle w:val="ListBullet"/>
+        <w:jc w:val="both"/>
       </w:pPr>
       <w:r>
         <w:t>¿Cómo podríamos ofrecer la clasificación en tiempo real sin exponer datos sensibles ni depender de servicios de IA de pago?</w:t>
@@ -1221,6 +1372,9 @@
             <w:tcW w:type="dxa" w:w="2160"/>
           </w:tcPr>
           <w:p>
+            <w:pPr>
+              <w:jc w:val="both"/>
+            </w:pPr>
             <w:r/>
             <w:r>
               <w:rPr>
@@ -1236,6 +1390,9 @@
             <w:tcW w:type="dxa" w:w="2160"/>
           </w:tcPr>
           <w:p>
+            <w:pPr>
+              <w:jc w:val="both"/>
+            </w:pPr>
             <w:r/>
             <w:r>
               <w:rPr>
@@ -1251,6 +1408,9 @@
             <w:tcW w:type="dxa" w:w="2160"/>
           </w:tcPr>
           <w:p>
+            <w:pPr>
+              <w:jc w:val="both"/>
+            </w:pPr>
             <w:r/>
             <w:r>
               <w:rPr>
@@ -1266,6 +1426,9 @@
             <w:tcW w:type="dxa" w:w="2160"/>
           </w:tcPr>
           <w:p>
+            <w:pPr>
+              <w:jc w:val="both"/>
+            </w:pPr>
             <w:r/>
             <w:r>
               <w:rPr>
@@ -1283,6 +1446,9 @@
             <w:tcW w:type="dxa" w:w="2160"/>
           </w:tcPr>
           <w:p>
+            <w:pPr>
+              <w:jc w:val="both"/>
+            </w:pPr>
             <w:r/>
             <w:r>
               <w:rPr>
@@ -1297,6 +1463,9 @@
             <w:tcW w:type="dxa" w:w="2160"/>
           </w:tcPr>
           <w:p>
+            <w:pPr>
+              <w:jc w:val="both"/>
+            </w:pPr>
             <w:r/>
             <w:r>
               <w:rPr>
@@ -1311,6 +1480,9 @@
             <w:tcW w:type="dxa" w:w="2160"/>
           </w:tcPr>
           <w:p>
+            <w:pPr>
+              <w:jc w:val="both"/>
+            </w:pPr>
             <w:r/>
             <w:r>
               <w:rPr>
@@ -1325,6 +1497,9 @@
             <w:tcW w:type="dxa" w:w="2160"/>
           </w:tcPr>
           <w:p>
+            <w:pPr>
+              <w:jc w:val="both"/>
+            </w:pPr>
             <w:r/>
             <w:r>
               <w:rPr>
@@ -1341,6 +1516,9 @@
             <w:tcW w:type="dxa" w:w="2160"/>
           </w:tcPr>
           <w:p>
+            <w:pPr>
+              <w:jc w:val="both"/>
+            </w:pPr>
             <w:r/>
             <w:r>
               <w:rPr>
@@ -1355,6 +1533,9 @@
             <w:tcW w:type="dxa" w:w="2160"/>
           </w:tcPr>
           <w:p>
+            <w:pPr>
+              <w:jc w:val="both"/>
+            </w:pPr>
             <w:r/>
             <w:r>
               <w:rPr>
@@ -1369,6 +1550,9 @@
             <w:tcW w:type="dxa" w:w="2160"/>
           </w:tcPr>
           <w:p>
+            <w:pPr>
+              <w:jc w:val="both"/>
+            </w:pPr>
             <w:r/>
             <w:r>
               <w:rPr>
@@ -1383,6 +1567,9 @@
             <w:tcW w:type="dxa" w:w="2160"/>
           </w:tcPr>
           <w:p>
+            <w:pPr>
+              <w:jc w:val="both"/>
+            </w:pPr>
             <w:r/>
             <w:r>
               <w:rPr>
@@ -1399,6 +1586,9 @@
             <w:tcW w:type="dxa" w:w="2160"/>
           </w:tcPr>
           <w:p>
+            <w:pPr>
+              <w:jc w:val="both"/>
+            </w:pPr>
             <w:r/>
             <w:r>
               <w:rPr>
@@ -1413,6 +1603,9 @@
             <w:tcW w:type="dxa" w:w="2160"/>
           </w:tcPr>
           <w:p>
+            <w:pPr>
+              <w:jc w:val="both"/>
+            </w:pPr>
             <w:r/>
             <w:r>
               <w:rPr>
@@ -1427,6 +1620,9 @@
             <w:tcW w:type="dxa" w:w="2160"/>
           </w:tcPr>
           <w:p>
+            <w:pPr>
+              <w:jc w:val="both"/>
+            </w:pPr>
             <w:r/>
             <w:r>
               <w:rPr>
@@ -1441,6 +1637,9 @@
             <w:tcW w:type="dxa" w:w="2160"/>
           </w:tcPr>
           <w:p>
+            <w:pPr>
+              <w:jc w:val="both"/>
+            </w:pPr>
             <w:r/>
             <w:r>
               <w:rPr>
@@ -1457,6 +1656,9 @@
             <w:tcW w:type="dxa" w:w="2160"/>
           </w:tcPr>
           <w:p>
+            <w:pPr>
+              <w:jc w:val="both"/>
+            </w:pPr>
             <w:r/>
             <w:r>
               <w:rPr>
@@ -1471,6 +1673,9 @@
             <w:tcW w:type="dxa" w:w="2160"/>
           </w:tcPr>
           <w:p>
+            <w:pPr>
+              <w:jc w:val="both"/>
+            </w:pPr>
             <w:r/>
             <w:r>
               <w:rPr>
@@ -1485,6 +1690,9 @@
             <w:tcW w:type="dxa" w:w="2160"/>
           </w:tcPr>
           <w:p>
+            <w:pPr>
+              <w:jc w:val="both"/>
+            </w:pPr>
             <w:r/>
             <w:r>
               <w:rPr>
@@ -1499,6 +1707,9 @@
             <w:tcW w:type="dxa" w:w="2160"/>
           </w:tcPr>
           <w:p>
+            <w:pPr>
+              <w:jc w:val="both"/>
+            </w:pPr>
             <w:r/>
             <w:r>
               <w:rPr>
@@ -1515,6 +1726,9 @@
             <w:tcW w:type="dxa" w:w="2160"/>
           </w:tcPr>
           <w:p>
+            <w:pPr>
+              <w:jc w:val="both"/>
+            </w:pPr>
             <w:r/>
             <w:r>
               <w:rPr>
@@ -1529,6 +1743,9 @@
             <w:tcW w:type="dxa" w:w="2160"/>
           </w:tcPr>
           <w:p>
+            <w:pPr>
+              <w:jc w:val="both"/>
+            </w:pPr>
             <w:r/>
             <w:r>
               <w:rPr>
@@ -1543,6 +1760,9 @@
             <w:tcW w:type="dxa" w:w="2160"/>
           </w:tcPr>
           <w:p>
+            <w:pPr>
+              <w:jc w:val="both"/>
+            </w:pPr>
             <w:r/>
             <w:r>
               <w:rPr>
@@ -1557,6 +1777,9 @@
             <w:tcW w:type="dxa" w:w="2160"/>
           </w:tcPr>
           <w:p>
+            <w:pPr>
+              <w:jc w:val="both"/>
+            </w:pPr>
             <w:r/>
             <w:r>
               <w:rPr>
@@ -1573,6 +1796,9 @@
             <w:tcW w:type="dxa" w:w="2160"/>
           </w:tcPr>
           <w:p>
+            <w:pPr>
+              <w:jc w:val="both"/>
+            </w:pPr>
             <w:r/>
             <w:r>
               <w:rPr>
@@ -1587,6 +1813,9 @@
             <w:tcW w:type="dxa" w:w="2160"/>
           </w:tcPr>
           <w:p>
+            <w:pPr>
+              <w:jc w:val="both"/>
+            </w:pPr>
             <w:r/>
             <w:r>
               <w:rPr>
@@ -1601,6 +1830,9 @@
             <w:tcW w:type="dxa" w:w="2160"/>
           </w:tcPr>
           <w:p>
+            <w:pPr>
+              <w:jc w:val="both"/>
+            </w:pPr>
             <w:r/>
             <w:r>
               <w:rPr>
@@ -1615,6 +1847,9 @@
             <w:tcW w:type="dxa" w:w="2160"/>
           </w:tcPr>
           <w:p>
+            <w:pPr>
+              <w:jc w:val="both"/>
+            </w:pPr>
             <w:r/>
             <w:r>
               <w:rPr>
@@ -1634,6 +1869,7 @@
     <w:p>
       <w:pPr>
         <w:spacing w:after="120"/>
+        <w:jc w:val="both"/>
       </w:pPr>
       <w:r>
         <w:rPr>
@@ -1646,6 +1882,7 @@
     <w:p>
       <w:pPr>
         <w:spacing w:after="120"/>
+        <w:jc w:val="both"/>
       </w:pPr>
       <w:r>
         <w:rPr>
@@ -1660,6 +1897,7 @@
     <w:p>
       <w:pPr>
         <w:spacing w:after="120"/>
+        <w:jc w:val="both"/>
       </w:pPr>
       <w:r>
         <w:rPr>
@@ -1682,6 +1920,7 @@
     <w:p>
       <w:pPr>
         <w:spacing w:after="120"/>
+        <w:jc w:val="both"/>
       </w:pPr>
       <w:r>
         <w:rPr>
@@ -1702,6 +1941,7 @@
     <w:p>
       <w:pPr>
         <w:spacing w:after="120"/>
+        <w:jc w:val="both"/>
       </w:pPr>
       <w:r>
         <w:rPr>
@@ -1714,6 +1954,7 @@
     <w:p>
       <w:pPr>
         <w:pStyle w:val="ListBullet"/>
+        <w:jc w:val="both"/>
       </w:pPr>
       <w:r>
         <w:t>Clasificación de texto: tarea de asignar a un documento una o más etiquetas de un conjunto predefinido; aquí se resuelve como una doble clasificación (categoría temática y nivel de urgencia).</w:t>
@@ -1722,6 +1963,7 @@
     <w:p>
       <w:pPr>
         <w:pStyle w:val="ListBullet"/>
+        <w:jc w:val="both"/>
       </w:pPr>
       <w:r>
         <w:t>Representación clásica TF-IDF: esquema que pondera cada término por su frecuencia en el documento y su rareza en el corpus, usado como entrada de modelos clásicos como la regresión logística y las máquinas de vectores de soporte (SVM).</w:t>
@@ -1730,6 +1972,7 @@
     <w:p>
       <w:pPr>
         <w:pStyle w:val="ListBullet"/>
+        <w:jc w:val="both"/>
       </w:pPr>
       <w:r>
         <w:t>Modelos de lenguaje basados en transformers: la arquitectura Transformer y el modelo BERT (Devlin et al., 2019) introdujeron representaciones contextuales bidireccionales que superan a los enfoques clásicos en numerosas tareas de PLN.</w:t>
@@ -1738,6 +1981,7 @@
     <w:p>
       <w:pPr>
         <w:pStyle w:val="ListBullet"/>
+        <w:jc w:val="both"/>
       </w:pPr>
       <w:r>
         <w:t>BETO: modelo tipo BERT preentrenado específicamente en español (Cañete et al., 2020), que permite el ajuste fino (fine-tuning) mediante transferencia de aprendizaje para tareas concretas como la de este proyecto.</w:t>
@@ -1746,6 +1990,7 @@
     <w:p>
       <w:pPr>
         <w:pStyle w:val="ListBullet"/>
+        <w:jc w:val="both"/>
       </w:pPr>
       <w:r>
         <w:t>Métricas de evaluación: exactitud, precisión, exhaustividad (recall) y medida F1, calculadas por clase, junto con la matriz de confusión para detectar confusiones entre categorías.</w:t>
@@ -1754,6 +1999,7 @@
     <w:p>
       <w:pPr>
         <w:pStyle w:val="ListBullet"/>
+        <w:jc w:val="both"/>
       </w:pPr>
       <w:r>
         <w:t>Acuerdo entre anotadores: el coeficiente kappa de Cohen (Cohen, 1960) mide la concordancia entre dos anotadores humanos más allá del azar y valida la calidad del etiquetado del corpus.</w:t>
@@ -1770,6 +2016,7 @@
     <w:p>
       <w:pPr>
         <w:spacing w:after="120"/>
+        <w:jc w:val="both"/>
       </w:pPr>
       <w:r>
         <w:rPr>
@@ -1799,6 +2046,9 @@
             <w:tcW w:type="dxa" w:w="1728"/>
           </w:tcPr>
           <w:p>
+            <w:pPr>
+              <w:jc w:val="both"/>
+            </w:pPr>
             <w:r/>
             <w:r>
               <w:rPr>
@@ -1814,6 +2064,9 @@
             <w:tcW w:type="dxa" w:w="1728"/>
           </w:tcPr>
           <w:p>
+            <w:pPr>
+              <w:jc w:val="both"/>
+            </w:pPr>
             <w:r/>
             <w:r>
               <w:rPr>
@@ -1829,6 +2082,9 @@
             <w:tcW w:type="dxa" w:w="1728"/>
           </w:tcPr>
           <w:p>
+            <w:pPr>
+              <w:jc w:val="both"/>
+            </w:pPr>
             <w:r/>
             <w:r>
               <w:rPr>
@@ -1844,6 +2100,9 @@
             <w:tcW w:type="dxa" w:w="1728"/>
           </w:tcPr>
           <w:p>
+            <w:pPr>
+              <w:jc w:val="both"/>
+            </w:pPr>
             <w:r/>
             <w:r>
               <w:rPr>
@@ -1859,6 +2118,9 @@
             <w:tcW w:type="dxa" w:w="1728"/>
           </w:tcPr>
           <w:p>
+            <w:pPr>
+              <w:jc w:val="both"/>
+            </w:pPr>
             <w:r/>
             <w:r>
               <w:rPr>
@@ -1876,6 +2138,9 @@
             <w:tcW w:type="dxa" w:w="1728"/>
           </w:tcPr>
           <w:p>
+            <w:pPr>
+              <w:jc w:val="both"/>
+            </w:pPr>
             <w:r/>
             <w:r>
               <w:rPr>
@@ -1890,6 +2155,9 @@
             <w:tcW w:type="dxa" w:w="1728"/>
           </w:tcPr>
           <w:p>
+            <w:pPr>
+              <w:jc w:val="both"/>
+            </w:pPr>
             <w:r/>
             <w:r>
               <w:rPr>
@@ -1904,6 +2172,9 @@
             <w:tcW w:type="dxa" w:w="1728"/>
           </w:tcPr>
           <w:p>
+            <w:pPr>
+              <w:jc w:val="both"/>
+            </w:pPr>
             <w:r/>
             <w:r>
               <w:rPr>
@@ -1918,6 +2189,9 @@
             <w:tcW w:type="dxa" w:w="1728"/>
           </w:tcPr>
           <w:p>
+            <w:pPr>
+              <w:jc w:val="both"/>
+            </w:pPr>
             <w:r/>
             <w:r>
               <w:rPr>
@@ -1932,6 +2206,9 @@
             <w:tcW w:type="dxa" w:w="1728"/>
           </w:tcPr>
           <w:p>
+            <w:pPr>
+              <w:jc w:val="both"/>
+            </w:pPr>
             <w:r/>
             <w:r>
               <w:rPr>
@@ -1948,6 +2225,9 @@
             <w:tcW w:type="dxa" w:w="1728"/>
           </w:tcPr>
           <w:p>
+            <w:pPr>
+              <w:jc w:val="both"/>
+            </w:pPr>
             <w:r/>
             <w:r>
               <w:rPr>
@@ -1962,6 +2242,9 @@
             <w:tcW w:type="dxa" w:w="1728"/>
           </w:tcPr>
           <w:p>
+            <w:pPr>
+              <w:jc w:val="both"/>
+            </w:pPr>
             <w:r/>
             <w:r>
               <w:rPr>
@@ -1976,6 +2259,9 @@
             <w:tcW w:type="dxa" w:w="1728"/>
           </w:tcPr>
           <w:p>
+            <w:pPr>
+              <w:jc w:val="both"/>
+            </w:pPr>
             <w:r/>
             <w:r>
               <w:rPr>
@@ -1990,6 +2276,9 @@
             <w:tcW w:type="dxa" w:w="1728"/>
           </w:tcPr>
           <w:p>
+            <w:pPr>
+              <w:jc w:val="both"/>
+            </w:pPr>
             <w:r/>
             <w:r>
               <w:rPr>
@@ -2004,6 +2293,9 @@
             <w:tcW w:type="dxa" w:w="1728"/>
           </w:tcPr>
           <w:p>
+            <w:pPr>
+              <w:jc w:val="both"/>
+            </w:pPr>
             <w:r/>
             <w:r>
               <w:rPr>
@@ -2020,6 +2312,9 @@
             <w:tcW w:type="dxa" w:w="1728"/>
           </w:tcPr>
           <w:p>
+            <w:pPr>
+              <w:jc w:val="both"/>
+            </w:pPr>
             <w:r/>
             <w:r>
               <w:rPr>
@@ -2034,6 +2329,9 @@
             <w:tcW w:type="dxa" w:w="1728"/>
           </w:tcPr>
           <w:p>
+            <w:pPr>
+              <w:jc w:val="both"/>
+            </w:pPr>
             <w:r/>
             <w:r>
               <w:rPr>
@@ -2048,6 +2346,9 @@
             <w:tcW w:type="dxa" w:w="1728"/>
           </w:tcPr>
           <w:p>
+            <w:pPr>
+              <w:jc w:val="both"/>
+            </w:pPr>
             <w:r/>
             <w:r>
               <w:rPr>
@@ -2062,6 +2363,9 @@
             <w:tcW w:type="dxa" w:w="1728"/>
           </w:tcPr>
           <w:p>
+            <w:pPr>
+              <w:jc w:val="both"/>
+            </w:pPr>
             <w:r/>
             <w:r>
               <w:rPr>
@@ -2076,6 +2380,9 @@
             <w:tcW w:type="dxa" w:w="1728"/>
           </w:tcPr>
           <w:p>
+            <w:pPr>
+              <w:jc w:val="both"/>
+            </w:pPr>
             <w:r/>
             <w:r>
               <w:rPr>
@@ -2092,6 +2399,9 @@
             <w:tcW w:type="dxa" w:w="1728"/>
           </w:tcPr>
           <w:p>
+            <w:pPr>
+              <w:jc w:val="both"/>
+            </w:pPr>
             <w:r/>
             <w:r>
               <w:rPr>
@@ -2106,6 +2416,9 @@
             <w:tcW w:type="dxa" w:w="1728"/>
           </w:tcPr>
           <w:p>
+            <w:pPr>
+              <w:jc w:val="both"/>
+            </w:pPr>
             <w:r/>
             <w:r>
               <w:rPr>
@@ -2120,6 +2433,9 @@
             <w:tcW w:type="dxa" w:w="1728"/>
           </w:tcPr>
           <w:p>
+            <w:pPr>
+              <w:jc w:val="both"/>
+            </w:pPr>
             <w:r/>
             <w:r>
               <w:rPr>
@@ -2134,6 +2450,9 @@
             <w:tcW w:type="dxa" w:w="1728"/>
           </w:tcPr>
           <w:p>
+            <w:pPr>
+              <w:jc w:val="both"/>
+            </w:pPr>
             <w:r/>
             <w:r>
               <w:rPr>
@@ -2148,6 +2467,9 @@
             <w:tcW w:type="dxa" w:w="1728"/>
           </w:tcPr>
           <w:p>
+            <w:pPr>
+              <w:jc w:val="both"/>
+            </w:pPr>
             <w:r/>
             <w:r>
               <w:rPr>
@@ -2167,6 +2489,7 @@
     <w:p>
       <w:pPr>
         <w:spacing w:after="120"/>
+        <w:jc w:val="both"/>
       </w:pPr>
       <w:r>
         <w:rPr>
@@ -2187,6 +2510,7 @@
     <w:p>
       <w:pPr>
         <w:spacing w:after="120"/>
+        <w:jc w:val="both"/>
       </w:pPr>
       <w:r>
         <w:rPr>
@@ -2217,6 +2541,9 @@
             <w:tcW w:type="dxa" w:w="1440"/>
           </w:tcPr>
           <w:p>
+            <w:pPr>
+              <w:jc w:val="both"/>
+            </w:pPr>
             <w:r/>
             <w:r>
               <w:rPr>
@@ -2232,6 +2559,9 @@
             <w:tcW w:type="dxa" w:w="1440"/>
           </w:tcPr>
           <w:p>
+            <w:pPr>
+              <w:jc w:val="both"/>
+            </w:pPr>
             <w:r/>
             <w:r>
               <w:rPr>
@@ -2247,6 +2577,9 @@
             <w:tcW w:type="dxa" w:w="1440"/>
           </w:tcPr>
           <w:p>
+            <w:pPr>
+              <w:jc w:val="both"/>
+            </w:pPr>
             <w:r/>
             <w:r>
               <w:rPr>
@@ -2262,6 +2595,9 @@
             <w:tcW w:type="dxa" w:w="1440"/>
           </w:tcPr>
           <w:p>
+            <w:pPr>
+              <w:jc w:val="both"/>
+            </w:pPr>
             <w:r/>
             <w:r>
               <w:rPr>
@@ -2277,6 +2613,9 @@
             <w:tcW w:type="dxa" w:w="1440"/>
           </w:tcPr>
           <w:p>
+            <w:pPr>
+              <w:jc w:val="both"/>
+            </w:pPr>
             <w:r/>
             <w:r>
               <w:rPr>
@@ -2292,6 +2631,9 @@
             <w:tcW w:type="dxa" w:w="1440"/>
           </w:tcPr>
           <w:p>
+            <w:pPr>
+              <w:jc w:val="both"/>
+            </w:pPr>
             <w:r/>
             <w:r>
               <w:rPr>
@@ -2309,6 +2651,9 @@
             <w:tcW w:type="dxa" w:w="1440"/>
           </w:tcPr>
           <w:p>
+            <w:pPr>
+              <w:jc w:val="both"/>
+            </w:pPr>
             <w:r/>
             <w:r>
               <w:rPr>
@@ -2323,6 +2668,9 @@
             <w:tcW w:type="dxa" w:w="1440"/>
           </w:tcPr>
           <w:p>
+            <w:pPr>
+              <w:jc w:val="both"/>
+            </w:pPr>
             <w:r/>
             <w:r>
               <w:rPr>
@@ -2337,6 +2685,9 @@
             <w:tcW w:type="dxa" w:w="1440"/>
           </w:tcPr>
           <w:p>
+            <w:pPr>
+              <w:jc w:val="both"/>
+            </w:pPr>
             <w:r/>
             <w:r>
               <w:rPr>
@@ -2351,6 +2702,9 @@
             <w:tcW w:type="dxa" w:w="1440"/>
           </w:tcPr>
           <w:p>
+            <w:pPr>
+              <w:jc w:val="both"/>
+            </w:pPr>
             <w:r/>
             <w:r>
               <w:rPr>
@@ -2365,6 +2719,9 @@
             <w:tcW w:type="dxa" w:w="1440"/>
           </w:tcPr>
           <w:p>
+            <w:pPr>
+              <w:jc w:val="both"/>
+            </w:pPr>
             <w:r/>
             <w:r>
               <w:rPr>
@@ -2379,6 +2736,9 @@
             <w:tcW w:type="dxa" w:w="1440"/>
           </w:tcPr>
           <w:p>
+            <w:pPr>
+              <w:jc w:val="both"/>
+            </w:pPr>
             <w:r/>
             <w:r>
               <w:rPr>
@@ -2395,6 +2755,9 @@
             <w:tcW w:type="dxa" w:w="1440"/>
           </w:tcPr>
           <w:p>
+            <w:pPr>
+              <w:jc w:val="both"/>
+            </w:pPr>
             <w:r/>
             <w:r>
               <w:rPr>
@@ -2409,6 +2772,9 @@
             <w:tcW w:type="dxa" w:w="1440"/>
           </w:tcPr>
           <w:p>
+            <w:pPr>
+              <w:jc w:val="both"/>
+            </w:pPr>
             <w:r/>
             <w:r>
               <w:rPr>
@@ -2423,6 +2789,9 @@
             <w:tcW w:type="dxa" w:w="1440"/>
           </w:tcPr>
           <w:p>
+            <w:pPr>
+              <w:jc w:val="both"/>
+            </w:pPr>
             <w:r/>
             <w:r>
               <w:rPr>
@@ -2437,6 +2806,9 @@
             <w:tcW w:type="dxa" w:w="1440"/>
           </w:tcPr>
           <w:p>
+            <w:pPr>
+              <w:jc w:val="both"/>
+            </w:pPr>
             <w:r/>
             <w:r>
               <w:rPr>
@@ -2451,6 +2823,9 @@
             <w:tcW w:type="dxa" w:w="1440"/>
           </w:tcPr>
           <w:p>
+            <w:pPr>
+              <w:jc w:val="both"/>
+            </w:pPr>
             <w:r/>
             <w:r>
               <w:rPr>
@@ -2465,6 +2840,9 @@
             <w:tcW w:type="dxa" w:w="1440"/>
           </w:tcPr>
           <w:p>
+            <w:pPr>
+              <w:jc w:val="both"/>
+            </w:pPr>
             <w:r/>
             <w:r>
               <w:rPr>
@@ -2481,6 +2859,9 @@
             <w:tcW w:type="dxa" w:w="1440"/>
           </w:tcPr>
           <w:p>
+            <w:pPr>
+              <w:jc w:val="both"/>
+            </w:pPr>
             <w:r/>
             <w:r>
               <w:rPr>
@@ -2495,6 +2876,9 @@
             <w:tcW w:type="dxa" w:w="1440"/>
           </w:tcPr>
           <w:p>
+            <w:pPr>
+              <w:jc w:val="both"/>
+            </w:pPr>
             <w:r/>
             <w:r>
               <w:rPr>
@@ -2509,6 +2893,9 @@
             <w:tcW w:type="dxa" w:w="1440"/>
           </w:tcPr>
           <w:p>
+            <w:pPr>
+              <w:jc w:val="both"/>
+            </w:pPr>
             <w:r/>
             <w:r>
               <w:rPr>
@@ -2523,6 +2910,9 @@
             <w:tcW w:type="dxa" w:w="1440"/>
           </w:tcPr>
           <w:p>
+            <w:pPr>
+              <w:jc w:val="both"/>
+            </w:pPr>
             <w:r/>
             <w:r>
               <w:rPr>
@@ -2537,6 +2927,9 @@
             <w:tcW w:type="dxa" w:w="1440"/>
           </w:tcPr>
           <w:p>
+            <w:pPr>
+              <w:jc w:val="both"/>
+            </w:pPr>
             <w:r/>
             <w:r>
               <w:rPr>
@@ -2551,6 +2944,9 @@
             <w:tcW w:type="dxa" w:w="1440"/>
           </w:tcPr>
           <w:p>
+            <w:pPr>
+              <w:jc w:val="both"/>
+            </w:pPr>
             <w:r/>
             <w:r>
               <w:rPr>
@@ -2567,6 +2963,9 @@
             <w:tcW w:type="dxa" w:w="1440"/>
           </w:tcPr>
           <w:p>
+            <w:pPr>
+              <w:jc w:val="both"/>
+            </w:pPr>
             <w:r/>
             <w:r>
               <w:rPr>
@@ -2581,6 +2980,9 @@
             <w:tcW w:type="dxa" w:w="1440"/>
           </w:tcPr>
           <w:p>
+            <w:pPr>
+              <w:jc w:val="both"/>
+            </w:pPr>
             <w:r/>
             <w:r>
               <w:rPr>
@@ -2595,6 +2997,9 @@
             <w:tcW w:type="dxa" w:w="1440"/>
           </w:tcPr>
           <w:p>
+            <w:pPr>
+              <w:jc w:val="both"/>
+            </w:pPr>
             <w:r/>
             <w:r>
               <w:rPr>
@@ -2609,6 +3014,9 @@
             <w:tcW w:type="dxa" w:w="1440"/>
           </w:tcPr>
           <w:p>
+            <w:pPr>
+              <w:jc w:val="both"/>
+            </w:pPr>
             <w:r/>
             <w:r>
               <w:rPr>
@@ -2623,6 +3031,9 @@
             <w:tcW w:type="dxa" w:w="1440"/>
           </w:tcPr>
           <w:p>
+            <w:pPr>
+              <w:jc w:val="both"/>
+            </w:pPr>
             <w:r/>
             <w:r>
               <w:rPr>
@@ -2637,6 +3048,9 @@
             <w:tcW w:type="dxa" w:w="1440"/>
           </w:tcPr>
           <w:p>
+            <w:pPr>
+              <w:jc w:val="both"/>
+            </w:pPr>
             <w:r/>
             <w:r>
               <w:rPr>
@@ -2656,6 +3070,7 @@
     <w:p>
       <w:pPr>
         <w:spacing w:after="120"/>
+        <w:jc w:val="both"/>
       </w:pPr>
       <w:r>
         <w:rPr>
@@ -2676,6 +3091,7 @@
     <w:p>
       <w:pPr>
         <w:spacing w:after="120"/>
+        <w:jc w:val="both"/>
       </w:pPr>
       <w:r>
         <w:rPr>
@@ -2688,6 +3104,7 @@
     <w:p>
       <w:pPr>
         <w:spacing w:after="120"/>
+        <w:jc w:val="both"/>
       </w:pPr>
       <w:r>
         <w:rPr>
@@ -2700,6 +3117,7 @@
     <w:p>
       <w:pPr>
         <w:pStyle w:val="ListBullet"/>
+        <w:jc w:val="both"/>
       </w:pPr>
       <w:r>
         <w:rPr>
@@ -2714,6 +3132,7 @@
     <w:p>
       <w:pPr>
         <w:pStyle w:val="ListBullet"/>
+        <w:jc w:val="both"/>
       </w:pPr>
       <w:r>
         <w:rPr>
@@ -2728,6 +3147,7 @@
     <w:p>
       <w:pPr>
         <w:pStyle w:val="ListBullet"/>
+        <w:jc w:val="both"/>
       </w:pPr>
       <w:r>
         <w:rPr>
@@ -2742,6 +3162,7 @@
     <w:p>
       <w:pPr>
         <w:pStyle w:val="ListBullet"/>
+        <w:jc w:val="both"/>
       </w:pPr>
       <w:r>
         <w:rPr>
@@ -2756,6 +3177,7 @@
     <w:p>
       <w:pPr>
         <w:pStyle w:val="ListBullet"/>
+        <w:jc w:val="both"/>
       </w:pPr>
       <w:r>
         <w:rPr>
@@ -2785,6 +3207,9 @@
             <w:tcW w:type="dxa" w:w="2880"/>
           </w:tcPr>
           <w:p>
+            <w:pPr>
+              <w:jc w:val="both"/>
+            </w:pPr>
             <w:r/>
             <w:r>
               <w:rPr>
@@ -2800,6 +3225,9 @@
             <w:tcW w:type="dxa" w:w="2880"/>
           </w:tcPr>
           <w:p>
+            <w:pPr>
+              <w:jc w:val="both"/>
+            </w:pPr>
             <w:r/>
             <w:r>
               <w:rPr>
@@ -2815,6 +3243,9 @@
             <w:tcW w:type="dxa" w:w="2880"/>
           </w:tcPr>
           <w:p>
+            <w:pPr>
+              <w:jc w:val="both"/>
+            </w:pPr>
             <w:r/>
             <w:r>
               <w:rPr>
@@ -2832,6 +3263,9 @@
             <w:tcW w:type="dxa" w:w="2880"/>
           </w:tcPr>
           <w:p>
+            <w:pPr>
+              <w:jc w:val="both"/>
+            </w:pPr>
             <w:r/>
             <w:r>
               <w:rPr>
@@ -2846,6 +3280,9 @@
             <w:tcW w:type="dxa" w:w="2880"/>
           </w:tcPr>
           <w:p>
+            <w:pPr>
+              <w:jc w:val="both"/>
+            </w:pPr>
             <w:r/>
             <w:r>
               <w:rPr>
@@ -2860,6 +3297,9 @@
             <w:tcW w:type="dxa" w:w="2880"/>
           </w:tcPr>
           <w:p>
+            <w:pPr>
+              <w:jc w:val="both"/>
+            </w:pPr>
             <w:r/>
             <w:r>
               <w:rPr>
@@ -2876,6 +3316,9 @@
             <w:tcW w:type="dxa" w:w="2880"/>
           </w:tcPr>
           <w:p>
+            <w:pPr>
+              <w:jc w:val="both"/>
+            </w:pPr>
             <w:r/>
             <w:r>
               <w:rPr>
@@ -2890,6 +3333,9 @@
             <w:tcW w:type="dxa" w:w="2880"/>
           </w:tcPr>
           <w:p>
+            <w:pPr>
+              <w:jc w:val="both"/>
+            </w:pPr>
             <w:r/>
             <w:r>
               <w:rPr>
@@ -2904,6 +3350,9 @@
             <w:tcW w:type="dxa" w:w="2880"/>
           </w:tcPr>
           <w:p>
+            <w:pPr>
+              <w:jc w:val="both"/>
+            </w:pPr>
             <w:r/>
             <w:r>
               <w:rPr>
@@ -2920,6 +3369,9 @@
             <w:tcW w:type="dxa" w:w="2880"/>
           </w:tcPr>
           <w:p>
+            <w:pPr>
+              <w:jc w:val="both"/>
+            </w:pPr>
             <w:r/>
             <w:r>
               <w:rPr>
@@ -2934,6 +3386,9 @@
             <w:tcW w:type="dxa" w:w="2880"/>
           </w:tcPr>
           <w:p>
+            <w:pPr>
+              <w:jc w:val="both"/>
+            </w:pPr>
             <w:r/>
             <w:r>
               <w:rPr>
@@ -2948,6 +3403,9 @@
             <w:tcW w:type="dxa" w:w="2880"/>
           </w:tcPr>
           <w:p>
+            <w:pPr>
+              <w:jc w:val="both"/>
+            </w:pPr>
             <w:r/>
             <w:r>
               <w:rPr>
@@ -2964,6 +3422,9 @@
             <w:tcW w:type="dxa" w:w="2880"/>
           </w:tcPr>
           <w:p>
+            <w:pPr>
+              <w:jc w:val="both"/>
+            </w:pPr>
             <w:r/>
             <w:r>
               <w:rPr>
@@ -2978,6 +3439,9 @@
             <w:tcW w:type="dxa" w:w="2880"/>
           </w:tcPr>
           <w:p>
+            <w:pPr>
+              <w:jc w:val="both"/>
+            </w:pPr>
             <w:r/>
             <w:r>
               <w:rPr>
@@ -2992,6 +3456,9 @@
             <w:tcW w:type="dxa" w:w="2880"/>
           </w:tcPr>
           <w:p>
+            <w:pPr>
+              <w:jc w:val="both"/>
+            </w:pPr>
             <w:r/>
             <w:r>
               <w:rPr>
@@ -3019,6 +3486,7 @@
     <w:p>
       <w:pPr>
         <w:spacing w:after="120"/>
+        <w:jc w:val="both"/>
       </w:pPr>
       <w:r>
         <w:rPr>
@@ -3048,6 +3516,9 @@
             <w:tcW w:type="dxa" w:w="1728"/>
           </w:tcPr>
           <w:p>
+            <w:pPr>
+              <w:jc w:val="both"/>
+            </w:pPr>
             <w:r/>
             <w:r>
               <w:rPr>
@@ -3063,6 +3534,9 @@
             <w:tcW w:type="dxa" w:w="1728"/>
           </w:tcPr>
           <w:p>
+            <w:pPr>
+              <w:jc w:val="both"/>
+            </w:pPr>
             <w:r/>
             <w:r>
               <w:rPr>
@@ -3078,6 +3552,9 @@
             <w:tcW w:type="dxa" w:w="1728"/>
           </w:tcPr>
           <w:p>
+            <w:pPr>
+              <w:jc w:val="both"/>
+            </w:pPr>
             <w:r/>
             <w:r>
               <w:rPr>
@@ -3093,6 +3570,9 @@
             <w:tcW w:type="dxa" w:w="1728"/>
           </w:tcPr>
           <w:p>
+            <w:pPr>
+              <w:jc w:val="both"/>
+            </w:pPr>
             <w:r/>
             <w:r>
               <w:rPr>
@@ -3108,6 +3588,9 @@
             <w:tcW w:type="dxa" w:w="1728"/>
           </w:tcPr>
           <w:p>
+            <w:pPr>
+              <w:jc w:val="both"/>
+            </w:pPr>
             <w:r/>
             <w:r>
               <w:rPr>
@@ -3125,6 +3608,9 @@
             <w:tcW w:type="dxa" w:w="1728"/>
           </w:tcPr>
           <w:p>
+            <w:pPr>
+              <w:jc w:val="both"/>
+            </w:pPr>
             <w:r/>
             <w:r>
               <w:rPr>
@@ -3139,6 +3625,9 @@
             <w:tcW w:type="dxa" w:w="1728"/>
           </w:tcPr>
           <w:p>
+            <w:pPr>
+              <w:jc w:val="both"/>
+            </w:pPr>
             <w:r/>
             <w:r>
               <w:rPr>
@@ -3153,6 +3642,9 @@
             <w:tcW w:type="dxa" w:w="1728"/>
           </w:tcPr>
           <w:p>
+            <w:pPr>
+              <w:jc w:val="both"/>
+            </w:pPr>
             <w:r/>
             <w:r>
               <w:rPr>
@@ -3167,6 +3659,9 @@
             <w:tcW w:type="dxa" w:w="1728"/>
           </w:tcPr>
           <w:p>
+            <w:pPr>
+              <w:jc w:val="both"/>
+            </w:pPr>
             <w:r/>
             <w:r>
               <w:rPr>
@@ -3181,6 +3676,9 @@
             <w:tcW w:type="dxa" w:w="1728"/>
           </w:tcPr>
           <w:p>
+            <w:pPr>
+              <w:jc w:val="both"/>
+            </w:pPr>
             <w:r/>
             <w:r>
               <w:rPr>
@@ -3197,6 +3695,9 @@
             <w:tcW w:type="dxa" w:w="1728"/>
           </w:tcPr>
           <w:p>
+            <w:pPr>
+              <w:jc w:val="both"/>
+            </w:pPr>
             <w:r/>
             <w:r>
               <w:rPr>
@@ -3211,6 +3712,9 @@
             <w:tcW w:type="dxa" w:w="1728"/>
           </w:tcPr>
           <w:p>
+            <w:pPr>
+              <w:jc w:val="both"/>
+            </w:pPr>
             <w:r/>
             <w:r>
               <w:rPr>
@@ -3225,6 +3729,9 @@
             <w:tcW w:type="dxa" w:w="1728"/>
           </w:tcPr>
           <w:p>
+            <w:pPr>
+              <w:jc w:val="both"/>
+            </w:pPr>
             <w:r/>
             <w:r>
               <w:rPr>
@@ -3239,6 +3746,9 @@
             <w:tcW w:type="dxa" w:w="1728"/>
           </w:tcPr>
           <w:p>
+            <w:pPr>
+              <w:jc w:val="both"/>
+            </w:pPr>
             <w:r/>
             <w:r>
               <w:rPr>
@@ -3253,6 +3763,9 @@
             <w:tcW w:type="dxa" w:w="1728"/>
           </w:tcPr>
           <w:p>
+            <w:pPr>
+              <w:jc w:val="both"/>
+            </w:pPr>
             <w:r/>
             <w:r>
               <w:rPr>
@@ -3269,6 +3782,9 @@
             <w:tcW w:type="dxa" w:w="1728"/>
           </w:tcPr>
           <w:p>
+            <w:pPr>
+              <w:jc w:val="both"/>
+            </w:pPr>
             <w:r/>
             <w:r>
               <w:rPr>
@@ -3283,6 +3799,9 @@
             <w:tcW w:type="dxa" w:w="1728"/>
           </w:tcPr>
           <w:p>
+            <w:pPr>
+              <w:jc w:val="both"/>
+            </w:pPr>
             <w:r/>
             <w:r>
               <w:rPr>
@@ -3297,6 +3816,9 @@
             <w:tcW w:type="dxa" w:w="1728"/>
           </w:tcPr>
           <w:p>
+            <w:pPr>
+              <w:jc w:val="both"/>
+            </w:pPr>
             <w:r/>
             <w:r>
               <w:rPr>
@@ -3311,6 +3833,9 @@
             <w:tcW w:type="dxa" w:w="1728"/>
           </w:tcPr>
           <w:p>
+            <w:pPr>
+              <w:jc w:val="both"/>
+            </w:pPr>
             <w:r/>
             <w:r>
               <w:rPr>
@@ -3325,6 +3850,9 @@
             <w:tcW w:type="dxa" w:w="1728"/>
           </w:tcPr>
           <w:p>
+            <w:pPr>
+              <w:jc w:val="both"/>
+            </w:pPr>
             <w:r/>
             <w:r>
               <w:rPr>
@@ -3341,6 +3869,9 @@
             <w:tcW w:type="dxa" w:w="1728"/>
           </w:tcPr>
           <w:p>
+            <w:pPr>
+              <w:jc w:val="both"/>
+            </w:pPr>
             <w:r>
               <w:t>Adopción responsable de IA — pilar Liderazgo de MELDS (15%)</w:t>
             </w:r>
@@ -3356,6 +3887,9 @@
             <w:tcW w:type="dxa" w:w="1728"/>
           </w:tcPr>
           <w:p>
+            <w:pPr>
+              <w:jc w:val="both"/>
+            </w:pPr>
             <w:r/>
             <w:r>
               <w:rPr>
@@ -3370,6 +3904,9 @@
             <w:tcW w:type="dxa" w:w="1728"/>
           </w:tcPr>
           <w:p>
+            <w:pPr>
+              <w:jc w:val="both"/>
+            </w:pPr>
             <w:r/>
             <w:r>
               <w:rPr>
@@ -3384,6 +3921,9 @@
             <w:tcW w:type="dxa" w:w="1728"/>
           </w:tcPr>
           <w:p>
+            <w:pPr>
+              <w:jc w:val="both"/>
+            </w:pPr>
             <w:r/>
             <w:r>
               <w:rPr>
@@ -3398,6 +3938,9 @@
             <w:tcW w:type="dxa" w:w="1728"/>
           </w:tcPr>
           <w:p>
+            <w:pPr>
+              <w:jc w:val="both"/>
+            </w:pPr>
             <w:r/>
             <w:r>
               <w:rPr>
@@ -3414,6 +3957,9 @@
             <w:tcW w:type="dxa" w:w="1728"/>
           </w:tcPr>
           <w:p>
+            <w:pPr>
+              <w:jc w:val="both"/>
+            </w:pPr>
             <w:r/>
             <w:r>
               <w:rPr>
@@ -3428,6 +3974,9 @@
             <w:tcW w:type="dxa" w:w="1728"/>
           </w:tcPr>
           <w:p>
+            <w:pPr>
+              <w:jc w:val="both"/>
+            </w:pPr>
             <w:r/>
             <w:r>
               <w:rPr>
@@ -3442,6 +3991,9 @@
             <w:tcW w:type="dxa" w:w="1728"/>
           </w:tcPr>
           <w:p>
+            <w:pPr>
+              <w:jc w:val="both"/>
+            </w:pPr>
             <w:r/>
             <w:r>
               <w:rPr>
@@ -3456,6 +4008,9 @@
             <w:tcW w:type="dxa" w:w="1728"/>
           </w:tcPr>
           <w:p>
+            <w:pPr>
+              <w:jc w:val="both"/>
+            </w:pPr>
             <w:r/>
             <w:r>
               <w:rPr>
@@ -3470,6 +4025,9 @@
             <w:tcW w:type="dxa" w:w="1728"/>
           </w:tcPr>
           <w:p>
+            <w:pPr>
+              <w:jc w:val="both"/>
+            </w:pPr>
             <w:r/>
             <w:r>
               <w:rPr>
@@ -3486,6 +4044,9 @@
             <w:tcW w:type="dxa" w:w="1728"/>
           </w:tcPr>
           <w:p>
+            <w:pPr>
+              <w:jc w:val="both"/>
+            </w:pPr>
             <w:r/>
             <w:r>
               <w:rPr>
@@ -3500,6 +4061,9 @@
             <w:tcW w:type="dxa" w:w="1728"/>
           </w:tcPr>
           <w:p>
+            <w:pPr>
+              <w:jc w:val="both"/>
+            </w:pPr>
             <w:r/>
             <w:r>
               <w:rPr>
@@ -3514,6 +4078,9 @@
             <w:tcW w:type="dxa" w:w="1728"/>
           </w:tcPr>
           <w:p>
+            <w:pPr>
+              <w:jc w:val="both"/>
+            </w:pPr>
             <w:r/>
             <w:r>
               <w:rPr>
@@ -3528,6 +4095,9 @@
             <w:tcW w:type="dxa" w:w="1728"/>
           </w:tcPr>
           <w:p>
+            <w:pPr>
+              <w:jc w:val="both"/>
+            </w:pPr>
             <w:r/>
             <w:r>
               <w:rPr>
@@ -3542,6 +4112,9 @@
             <w:tcW w:type="dxa" w:w="1728"/>
           </w:tcPr>
           <w:p>
+            <w:pPr>
+              <w:jc w:val="both"/>
+            </w:pPr>
             <w:r/>
             <w:r>
               <w:rPr>
@@ -3561,6 +4134,7 @@
     <w:p>
       <w:pPr>
         <w:spacing w:after="120"/>
+        <w:jc w:val="both"/>
       </w:pPr>
       <w:r>
         <w:rPr>
@@ -3587,6 +4161,7 @@
       <w:pPr>
         <w:spacing w:after="160"/>
         <w:ind w:left="720" w:hanging="720"/>
+        <w:jc w:val="both"/>
       </w:pPr>
       <w:r>
         <w:t>Cañete, J., Chaperon, G., Fuentes, R., Ho, J.-H., Kang, H., &amp; Pérez, J. (2020). Spanish pre-trained BERT model and evaluation data. En PML4DC at ICLR 2020. https://users.dcc.uchile.cl/~jperez/papers/pml4dc2020.pdf</w:t>
@@ -3596,6 +4171,7 @@
       <w:pPr>
         <w:spacing w:after="160"/>
         <w:ind w:left="720" w:hanging="720"/>
+        <w:jc w:val="both"/>
       </w:pPr>
       <w:r>
         <w:t>Cohen, J. (1960). A coefficient of agreement for nominal scales. Educational and Psychological Measurement, 20(1), 37-46. https://doi.org/10.1177/001316446002000104</w:t>
@@ -3605,6 +4181,7 @@
       <w:pPr>
         <w:spacing w:after="160"/>
         <w:ind w:left="720" w:hanging="720"/>
+        <w:jc w:val="both"/>
       </w:pPr>
       <w:r>
         <w:t xml:space="preserve">Daugherty, P. R., &amp; Wilson, H. J. (2018). </w:t>
@@ -3623,6 +4200,7 @@
       <w:pPr>
         <w:spacing w:after="160"/>
         <w:ind w:left="720" w:hanging="720"/>
+        <w:jc w:val="both"/>
       </w:pPr>
       <w:r>
         <w:t>Devlin, J., Chang, M.-W., Lee, K., &amp; Toutanova, K. (2019). BERT: Pre-training of deep bidirectional transformers for language understanding. En Proceedings of NAACL-HLT 2019 (pp. 4171-4186). https://doi.org/10.18653/v1/N19-1423</w:t>
@@ -3632,6 +4210,7 @@
       <w:pPr>
         <w:spacing w:after="160"/>
         <w:ind w:left="720" w:hanging="720"/>
+        <w:jc w:val="both"/>
       </w:pPr>
       <w:r>
         <w:t>Franco Cantos, J. H. (2024). Identificación automática de tweets de emergencia en la red social "X": caso de estudio en Ecuador [Tesis de maestría, Pontificia Universidad Católica del Ecuador]. https://repositorio.puce.edu.ec/server/api/core/bitstreams/17173477-6e8e-49ee-b041-3289294c5e3d/content</w:t>
@@ -3641,6 +4220,7 @@
       <w:pPr>
         <w:spacing w:after="160"/>
         <w:ind w:left="720" w:hanging="720"/>
+        <w:jc w:val="both"/>
       </w:pPr>
       <w:r>
         <w:t>Imran, M., Castillo, C., Diaz, F., &amp; Vieweg, S. (2015). Processing social media messages in mass emergency: A survey. ACM Computing Surveys, 47(4), Artículo 67. https://doi.org/10.1145/2771588</w:t>
@@ -3650,6 +4230,7 @@
       <w:pPr>
         <w:spacing w:after="160"/>
         <w:ind w:left="720" w:hanging="720"/>
+        <w:jc w:val="both"/>
       </w:pPr>
       <w:r>
         <w:t>Paltin, D., Mejía, J., Orellana, M., &amp; Zambrano-Martínez, J. (2025). Modelado semántico de emergencias del ECU 911 con NLP y ontologías. Revista Tecnológica ESPOL, 37(E1), 112-125. https://doi.org/10.37815/rte.v37nE1.1351</w:t>
@@ -3667,7 +4248,9 @@
       </w:r>
     </w:p>
     <w:p>
-      <w:pPr/>
+      <w:pPr>
+        <w:jc w:val="both"/>
+      </w:pPr>
       <w:r>
         <w:t>Como parte de la etapa Empatizar se aplicó una encuesta ciudadana anónima mediante un formulario en línea, difundido entre personas que vivieron o presenciaron una emergencia. El instrumento es anónimo (no recoge nombres, teléfonos ni direcciones) y se respondió con fines exclusivamente académicos. Se recibieron 42 respuestas.</w:t>
       </w:r>
@@ -3683,73 +4266,82 @@
     <w:p>
       <w:pPr>
         <w:pStyle w:val="ListNumber"/>
+        <w:jc w:val="both"/>
       </w:pPr>
       <w:r>
-        <w:t>1. ¿Has vivido o presenciado una emergencia en tu localidad? (opción única)</w:t>
+        <w:t>¿Has vivido o presenciado una emergencia en tu localidad? (opción única)</w:t>
       </w:r>
     </w:p>
     <w:p>
       <w:pPr>
         <w:pStyle w:val="ListNumber"/>
+        <w:jc w:val="both"/>
       </w:pPr>
       <w:r>
-        <w:t>2. ¿Qué tipo de emergencia? (casillas: inundación, deslave, incendio, caída de poste o cable, persona en riesgo, otro)</w:t>
+        <w:t>¿Qué tipo de emergencia? (casillas: inundación, deslave, incendio, caída de poste o cable, persona en riesgo, otro)</w:t>
       </w:r>
     </w:p>
     <w:p>
       <w:pPr>
         <w:pStyle w:val="ListNumber"/>
+        <w:jc w:val="both"/>
       </w:pPr>
       <w:r>
-        <w:t>3. ¿Reportaste o intentaste reportar la emergencia? (opción única)</w:t>
+        <w:t>¿Reportaste o intentaste reportar la emergencia? (opción única)</w:t>
       </w:r>
     </w:p>
     <w:p>
       <w:pPr>
         <w:pStyle w:val="ListNumber"/>
+        <w:jc w:val="both"/>
       </w:pPr>
       <w:r>
-        <w:t>4. Si reportaste, ¿por qué medio? (casillas: 911, redes sociales, WhatsApp, en persona, no reporté, otro)</w:t>
+        <w:t>Si reportaste, ¿por qué medio? (casillas: 911, redes sociales, WhatsApp, en persona, no reporté, otro)</w:t>
       </w:r>
     </w:p>
     <w:p>
       <w:pPr>
         <w:pStyle w:val="ListNumber"/>
+        <w:jc w:val="both"/>
       </w:pPr>
       <w:r>
-        <w:t>5. ¿Qué fue lo más difícil o frustrante al pedir o dar aviso de ayuda? (texto libre)</w:t>
+        <w:t>¿Qué fue lo más difícil o frustrante al pedir o dar aviso de ayuda? (texto libre)</w:t>
       </w:r>
     </w:p>
     <w:p>
       <w:pPr>
         <w:pStyle w:val="ListNumber"/>
+        <w:jc w:val="both"/>
       </w:pPr>
       <w:r>
-        <w:t>6. ¿Supiste si tu reporte fue recibido o atendido? (opción única)</w:t>
+        <w:t>¿Supiste si tu reporte fue recibido o atendido? (opción única)</w:t>
       </w:r>
     </w:p>
     <w:p>
       <w:pPr>
         <w:pStyle w:val="ListNumber"/>
+        <w:jc w:val="both"/>
       </w:pPr>
       <w:r>
-        <w:t>7. ¿Qué tan seguro/a estabas de que la ayuda llegaría a tiempo? (escala 1–5)</w:t>
+        <w:t>¿Qué tan seguro/a estabas de que la ayuda llegaría a tiempo? (escala 1–5)</w:t>
       </w:r>
     </w:p>
     <w:p>
       <w:pPr>
         <w:pStyle w:val="ListNumber"/>
+        <w:jc w:val="both"/>
       </w:pPr>
       <w:r>
-        <w:t>8. ¿Qué te habría gustado que pasara con tu reporte? (texto libre)</w:t>
+        <w:t>¿Qué te habría gustado que pasara con tu reporte? (texto libre)</w:t>
       </w:r>
     </w:p>
     <w:p>
       <w:pPr>
         <w:pStyle w:val="ListNumber"/>
+        <w:jc w:val="both"/>
       </w:pPr>
       <w:r>
-        <w:t>9. Si pudieras pedir UNA cosa a un sistema que recibe estos reportes, ¿cuál sería? (texto libre)</w:t>
+        <w:t>Si pudieras pedir UNA cosa a un sistema que recibe estos reportes, ¿cuál sería? (texto libre)</w:t>
       </w:r>
     </w:p>
     <w:p>
@@ -3761,7 +4353,9 @@
       </w:r>
     </w:p>
     <w:p>
-      <w:pPr/>
+      <w:pPr>
+        <w:jc w:val="both"/>
+      </w:pPr>
       <w:r>
         <w:t>Tipos de emergencia más mencionados (pregunta de opción múltiple):</w:t>
       </w:r>
@@ -3782,6 +4376,9 @@
             <w:tcW w:type="dxa" w:w="4320"/>
           </w:tcPr>
           <w:p>
+            <w:pPr>
+              <w:jc w:val="both"/>
+            </w:pPr>
             <w:r>
               <w:rPr>
                 <w:b/>
@@ -3795,6 +4392,9 @@
             <w:tcW w:type="dxa" w:w="4320"/>
           </w:tcPr>
           <w:p>
+            <w:pPr>
+              <w:jc w:val="both"/>
+            </w:pPr>
             <w:r>
               <w:rPr>
                 <w:b/>
@@ -3810,6 +4410,9 @@
             <w:tcW w:type="dxa" w:w="4320"/>
           </w:tcPr>
           <w:p>
+            <w:pPr>
+              <w:jc w:val="both"/>
+            </w:pPr>
             <w:r>
               <w:rPr>
                 <w:b w:val="0"/>
@@ -3823,6 +4426,9 @@
             <w:tcW w:type="dxa" w:w="4320"/>
           </w:tcPr>
           <w:p>
+            <w:pPr>
+              <w:jc w:val="both"/>
+            </w:pPr>
             <w:r>
               <w:rPr>
                 <w:b w:val="0"/>
@@ -3838,6 +4444,9 @@
             <w:tcW w:type="dxa" w:w="4320"/>
           </w:tcPr>
           <w:p>
+            <w:pPr>
+              <w:jc w:val="both"/>
+            </w:pPr>
             <w:r>
               <w:rPr>
                 <w:b w:val="0"/>
@@ -3851,6 +4460,9 @@
             <w:tcW w:type="dxa" w:w="4320"/>
           </w:tcPr>
           <w:p>
+            <w:pPr>
+              <w:jc w:val="both"/>
+            </w:pPr>
             <w:r>
               <w:rPr>
                 <w:b w:val="0"/>
@@ -3866,6 +4478,9 @@
             <w:tcW w:type="dxa" w:w="4320"/>
           </w:tcPr>
           <w:p>
+            <w:pPr>
+              <w:jc w:val="both"/>
+            </w:pPr>
             <w:r>
               <w:rPr>
                 <w:b w:val="0"/>
@@ -3879,6 +4494,9 @@
             <w:tcW w:type="dxa" w:w="4320"/>
           </w:tcPr>
           <w:p>
+            <w:pPr>
+              <w:jc w:val="both"/>
+            </w:pPr>
             <w:r>
               <w:rPr>
                 <w:b w:val="0"/>
@@ -3894,6 +4512,9 @@
             <w:tcW w:type="dxa" w:w="4320"/>
           </w:tcPr>
           <w:p>
+            <w:pPr>
+              <w:jc w:val="both"/>
+            </w:pPr>
             <w:r>
               <w:rPr>
                 <w:b w:val="0"/>
@@ -3907,6 +4528,9 @@
             <w:tcW w:type="dxa" w:w="4320"/>
           </w:tcPr>
           <w:p>
+            <w:pPr>
+              <w:jc w:val="both"/>
+            </w:pPr>
             <w:r>
               <w:rPr>
                 <w:b w:val="0"/>
@@ -3922,6 +4546,9 @@
             <w:tcW w:type="dxa" w:w="4320"/>
           </w:tcPr>
           <w:p>
+            <w:pPr>
+              <w:jc w:val="both"/>
+            </w:pPr>
             <w:r>
               <w:rPr>
                 <w:b w:val="0"/>
@@ -3935,6 +4562,9 @@
             <w:tcW w:type="dxa" w:w="4320"/>
           </w:tcPr>
           <w:p>
+            <w:pPr>
+              <w:jc w:val="both"/>
+            </w:pPr>
             <w:r>
               <w:rPr>
                 <w:b w:val="0"/>
@@ -3950,6 +4580,9 @@
             <w:tcW w:type="dxa" w:w="4320"/>
           </w:tcPr>
           <w:p>
+            <w:pPr>
+              <w:jc w:val="both"/>
+            </w:pPr>
             <w:r>
               <w:rPr>
                 <w:b w:val="0"/>
@@ -3963,6 +4596,9 @@
             <w:tcW w:type="dxa" w:w="4320"/>
           </w:tcPr>
           <w:p>
+            <w:pPr>
+              <w:jc w:val="both"/>
+            </w:pPr>
             <w:r>
               <w:rPr>
                 <w:b w:val="0"/>
@@ -3977,7 +4613,9 @@
       <w:pPr/>
     </w:p>
     <w:p>
-      <w:pPr/>
+      <w:pPr>
+        <w:jc w:val="both"/>
+      </w:pPr>
       <w:r>
         <w:t>Confianza en que la ayuda llegaría a tiempo (escala 1 = nada seguro a 5 = totalmente seguro; 36 respuestas válidas): media de 2.3. El 64 % la calificó con 1 o 2 y solo el 17 % con 4 o 5.</w:t>
       </w:r>
@@ -3991,7 +4629,9 @@
       </w:r>
     </w:p>
     <w:p>
-      <w:pPr/>
+      <w:pPr>
+        <w:jc w:val="both"/>
+      </w:pPr>
       <w:r>
         <w:t>Sobre lo más difícil o frustrante (dolores):</w:t>
       </w:r>
@@ -3999,6 +4639,7 @@
     <w:p>
       <w:pPr>
         <w:pStyle w:val="ListBullet"/>
+        <w:jc w:val="both"/>
       </w:pPr>
       <w:r>
         <w:t>“El tiempo de respuesta, la demora para la atención.”</w:t>
@@ -4007,6 +4648,7 @@
     <w:p>
       <w:pPr>
         <w:pStyle w:val="ListBullet"/>
+        <w:jc w:val="both"/>
       </w:pPr>
       <w:r>
         <w:t>“No contestaban las llamadas.”</w:t>
@@ -4015,6 +4657,7 @@
     <w:p>
       <w:pPr>
         <w:pStyle w:val="ListBullet"/>
+        <w:jc w:val="both"/>
       </w:pPr>
       <w:r>
         <w:t>“La lentitud con la que atienden y piden datos.”</w:t>
@@ -4023,6 +4666,7 @@
     <w:p>
       <w:pPr>
         <w:pStyle w:val="ListBullet"/>
+        <w:jc w:val="both"/>
       </w:pPr>
       <w:r>
         <w:t>“La falta de empatía y la cantidad de preguntas aún en medio de la emergencia.”</w:t>
@@ -4031,13 +4675,16 @@
     <w:p>
       <w:pPr>
         <w:pStyle w:val="ListBullet"/>
+        <w:jc w:val="both"/>
       </w:pPr>
       <w:r>
         <w:t>“Me dijeron que como aún no había nadie en riesgo, atenderían otras prioridades… fue súper frustrante.”</w:t>
       </w:r>
     </w:p>
     <w:p>
-      <w:pPr/>
+      <w:pPr>
+        <w:jc w:val="both"/>
+      </w:pPr>
       <w:r>
         <w:t>Sobre lo que les habría gustado y lo que pedirían (beneficios esperados):</w:t>
       </w:r>
@@ -4045,6 +4692,7 @@
     <w:p>
       <w:pPr>
         <w:pStyle w:val="ListBullet"/>
+        <w:jc w:val="both"/>
       </w:pPr>
       <w:r>
         <w:t>“Que me indicara si mi reporte tiene prioridad o en qué estatus está.”</w:t>
@@ -4053,6 +4701,7 @@
     <w:p>
       <w:pPr>
         <w:pStyle w:val="ListBullet"/>
+        <w:jc w:val="both"/>
       </w:pPr>
       <w:r>
         <w:t>“Monitoreo de la cuadrilla asignada a la resolución del incidente.”</w:t>
@@ -4061,6 +4710,7 @@
     <w:p>
       <w:pPr>
         <w:pStyle w:val="ListBullet"/>
+        <w:jc w:val="both"/>
       </w:pPr>
       <w:r>
         <w:t>“Trazabilidad del estatus del reporte, por ejemplo si pedí una ambulancia, poder ver por dónde viene.”</w:t>
@@ -4069,6 +4719,7 @@
     <w:p>
       <w:pPr>
         <w:pStyle w:val="ListBullet"/>
+        <w:jc w:val="both"/>
       </w:pPr>
       <w:r>
         <w:t>“Que tengan otros medios de comunicación donde no se sature rápido para comunicarse.”</w:t>
@@ -4077,6 +4728,7 @@
     <w:p>
       <w:pPr>
         <w:pStyle w:val="ListBullet"/>
+        <w:jc w:val="both"/>
       </w:pPr>
       <w:r>
         <w:t>“Aviso a las autoridades y atención por nivel de emergencia.”</w:t>

</xml_diff>